<commit_message>
[2026-07-21] 日常 - 天策MCP与Skill能力映射分析(移除tiance-metadata)
</commit_message>
<xml_diff>
--- a/日常/2026-07-21/天策MCP与Skill能力映射分析.docx
+++ b/日常/2026-07-21/天策MCP与Skill能力映射分析.docx
@@ -22,7 +22,7 @@
         <w:rPr>
           <w:rFonts w:ascii="Arial" w:eastAsia="Microsoft YaHei"/>
         </w:rPr>
-        <w:t xml:space="preserve">基于本地 20 个 tiance-* skill 的逐条代码分析，对照 Tiance MCP 需求文档，梳理每个 skill 中可被 MCP 替代的具体能力点。</w:t>
+        <w:t xml:space="preserve">基于本地 19 个 tiance-* skill 的逐条代码分析（排除已废弃的 tiance-metadata），对照 Tiance MCP 需求文档，梳理每个 skill 中可被 MCP 替代的具体能力点。</w:t>
       </w:r>
     </w:p>
     <w:p>
@@ -54,7 +54,7 @@
         <w:rPr>
           <w:rFonts w:ascii="Arial" w:eastAsia="Microsoft YaHei"/>
         </w:rPr>
-        <w:t xml:space="preserve">1. tiance-metadata（15 个端点 → MCP 元数据工具）</w:t>
+        <w:t xml:space="preserve">1. tiance-metadata-scout（42 个端点 → MCP 元数据工具）</w:t>
       </w:r>
     </w:p>
     <w:p>
@@ -66,31 +66,7 @@
         <w:rPr>
           <w:rFonts w:ascii="Arial" w:eastAsia="Microsoft YaHei"/>
         </w:rPr>
-        <w:t xml:space="preserve">当前实现：通过浏览器执行同步 XHR，逐条调用 15 个 REST 端点，手动管理 </w:t>
-      </w:r>
-      <w:r>
-        <w:rPr>
-          <w:rFonts w:ascii="Consolas" w:cs="Consolas" w:eastAsia="Consolas" w:hAnsi="Consolas"/>
-        </w:rPr>
-        <w:t xml:space="preserve">sessionStorage._csrf_</w:t>
-      </w:r>
-      <w:r>
-        <w:rPr>
-          <w:rFonts w:ascii="Arial" w:eastAsia="Microsoft YaHei"/>
-        </w:rPr>
-        <w:t xml:space="preserve"> 和 </w:t>
-      </w:r>
-      <w:r>
-        <w:rPr>
-          <w:rFonts w:ascii="Consolas" w:cs="Consolas" w:eastAsia="Consolas" w:hAnsi="Consolas"/>
-        </w:rPr>
-        <w:t xml:space="preserve">X-Cf-Random</w:t>
-      </w:r>
-      <w:r>
-        <w:rPr>
-          <w:rFonts w:ascii="Arial" w:eastAsia="Microsoft YaHei"/>
-        </w:rPr>
-        <w:t xml:space="preserve">，输出 10 个 JSON 文件。</w:t>
+        <w:t xml:space="preserve">当前实现：42 个端点分 13 类（A-M），支持 4 种连接模式（Gateway Proxy &gt; 原生浏览器 &gt; Puppeteer &gt; 手动），输出 25+ JSON 文件。</w:t>
       </w:r>
     </w:p>
     <w:p>
@@ -195,498 +171,34 @@
           <w:p>
             <w:r>
               <w:rPr>
-                <w:rFonts w:ascii="Consolas" w:cs="Consolas" w:eastAsia="Consolas" w:hAnsi="Consolas"/>
-              </w:rPr>
-              <w:t xml:space="preserve">/bridgeApi/app/all</w:t>
-            </w:r>
-            <w:r>
-              <w:rPr>
-                <w:rFonts w:ascii="Arial" w:eastAsia="Microsoft YaHei"/>
-              </w:rPr>
-              <w:t xml:space="preserve"> 获取渠道/应用</w:t>
-            </w:r>
-          </w:p>
-        </w:tc>
-        <w:tc>
-          <w:tcPr>
-            <w:tcW w:type="dxa" w:w="4513"/>
-            <w:tcBorders>
-              <w:top w:val="single" w:color="CCCCCC" w:sz="1"/>
-              <w:left w:val="single" w:color="CCCCCC" w:sz="1"/>
-              <w:bottom w:val="single" w:color="CCCCCC" w:sz="1"/>
-              <w:right w:val="single" w:color="CCCCCC" w:sz="1"/>
-            </w:tcBorders>
-            <w:tcMar>
-              <w:top w:type="dxa" w:w="80"/>
-              <w:left w:type="dxa" w:w="120"/>
-              <w:bottom w:type="dxa" w:w="80"/>
-              <w:right w:type="dxa" w:w="120"/>
-            </w:tcMar>
-          </w:tcPr>
-          <w:p>
-            <w:r>
-              <w:rPr>
-                <w:rFonts w:ascii="Consolas" w:cs="Consolas" w:eastAsia="Consolas" w:hAnsi="Consolas"/>
-              </w:rPr>
-              <w:t xml:space="preserve">tiance.search_entities(type="channel_app")</w:t>
-            </w:r>
-          </w:p>
-        </w:tc>
-      </w:tr>
-      <w:tr>
-        <w:tc>
-          <w:tcPr>
-            <w:tcW w:type="dxa" w:w="4513"/>
-            <w:tcBorders>
-              <w:top w:val="single" w:color="CCCCCC" w:sz="1"/>
-              <w:left w:val="single" w:color="CCCCCC" w:sz="1"/>
-              <w:bottom w:val="single" w:color="CCCCCC" w:sz="1"/>
-              <w:right w:val="single" w:color="CCCCCC" w:sz="1"/>
-            </w:tcBorders>
-            <w:tcMar>
-              <w:top w:type="dxa" w:w="80"/>
-              <w:left w:type="dxa" w:w="120"/>
-              <w:bottom w:type="dxa" w:w="80"/>
-              <w:right w:type="dxa" w:w="120"/>
-            </w:tcMar>
-          </w:tcPr>
-          <w:p>
-            <w:r>
-              <w:rPr>
-                <w:rFonts w:ascii="Consolas" w:cs="Consolas" w:eastAsia="Consolas" w:hAnsi="Consolas"/>
-              </w:rPr>
-              <w:t xml:space="preserve">/bridgeApi/systemField/allField</w:t>
-            </w:r>
-            <w:r>
-              <w:rPr>
-                <w:rFonts w:ascii="Arial" w:eastAsia="Microsoft YaHei"/>
-              </w:rPr>
-              <w:t xml:space="preserve"> 获取系统字段</w:t>
-            </w:r>
-          </w:p>
-        </w:tc>
-        <w:tc>
-          <w:tcPr>
-            <w:tcW w:type="dxa" w:w="4513"/>
-            <w:tcBorders>
-              <w:top w:val="single" w:color="CCCCCC" w:sz="1"/>
-              <w:left w:val="single" w:color="CCCCCC" w:sz="1"/>
-              <w:bottom w:val="single" w:color="CCCCCC" w:sz="1"/>
-              <w:right w:val="single" w:color="CCCCCC" w:sz="1"/>
-            </w:tcBorders>
-            <w:tcMar>
-              <w:top w:type="dxa" w:w="80"/>
-              <w:left w:type="dxa" w:w="120"/>
-              <w:bottom w:type="dxa" w:w="80"/>
-              <w:right w:type="dxa" w:w="120"/>
-            </w:tcMar>
-          </w:tcPr>
-          <w:p>
-            <w:r>
-              <w:rPr>
-                <w:rFonts w:ascii="Consolas" w:cs="Consolas" w:eastAsia="Consolas" w:hAnsi="Consolas"/>
-              </w:rPr>
-              <w:t xml:space="preserve">tiance.search_entities(type="field")</w:t>
-            </w:r>
-          </w:p>
-        </w:tc>
-      </w:tr>
-      <w:tr>
-        <w:tc>
-          <w:tcPr>
-            <w:tcW w:type="dxa" w:w="4513"/>
-            <w:tcBorders>
-              <w:top w:val="single" w:color="CCCCCC" w:sz="1"/>
-              <w:left w:val="single" w:color="CCCCCC" w:sz="1"/>
-              <w:bottom w:val="single" w:color="CCCCCC" w:sz="1"/>
-              <w:right w:val="single" w:color="CCCCCC" w:sz="1"/>
-            </w:tcBorders>
-            <w:tcMar>
-              <w:top w:type="dxa" w:w="80"/>
-              <w:left w:type="dxa" w:w="120"/>
-              <w:bottom w:type="dxa" w:w="80"/>
-              <w:right w:type="dxa" w:w="120"/>
-            </w:tcMar>
-          </w:tcPr>
-          <w:p>
-            <w:r>
-              <w:rPr>
-                <w:rFonts w:ascii="Consolas" w:cs="Consolas" w:eastAsia="Consolas" w:hAnsi="Consolas"/>
-              </w:rPr>
-              <w:t xml:space="preserve">/bridgeApi/org/all</w:t>
-            </w:r>
-            <w:r>
-              <w:rPr>
-                <w:rFonts w:ascii="Arial" w:eastAsia="Microsoft YaHei"/>
-              </w:rPr>
-              <w:t xml:space="preserve"> 获取机构树</w:t>
-            </w:r>
-          </w:p>
-        </w:tc>
-        <w:tc>
-          <w:tcPr>
-            <w:tcW w:type="dxa" w:w="4513"/>
-            <w:tcBorders>
-              <w:top w:val="single" w:color="CCCCCC" w:sz="1"/>
-              <w:left w:val="single" w:color="CCCCCC" w:sz="1"/>
-              <w:bottom w:val="single" w:color="CCCCCC" w:sz="1"/>
-              <w:right w:val="single" w:color="CCCCCC" w:sz="1"/>
-            </w:tcBorders>
-            <w:tcMar>
-              <w:top w:type="dxa" w:w="80"/>
-              <w:left w:type="dxa" w:w="120"/>
-              <w:bottom w:type="dxa" w:w="80"/>
-              <w:right w:type="dxa" w:w="120"/>
-            </w:tcMar>
-          </w:tcPr>
-          <w:p>
-            <w:r>
-              <w:rPr>
-                <w:rFonts w:ascii="Consolas" w:cs="Consolas" w:eastAsia="Consolas" w:hAnsi="Consolas"/>
-              </w:rPr>
-              <w:t xml:space="preserve">tiance.search_entities(type="organization")</w:t>
-            </w:r>
-          </w:p>
-        </w:tc>
-      </w:tr>
-      <w:tr>
-        <w:tc>
-          <w:tcPr>
-            <w:tcW w:type="dxa" w:w="4513"/>
-            <w:tcBorders>
-              <w:top w:val="single" w:color="CCCCCC" w:sz="1"/>
-              <w:left w:val="single" w:color="CCCCCC" w:sz="1"/>
-              <w:bottom w:val="single" w:color="CCCCCC" w:sz="1"/>
-              <w:right w:val="single" w:color="CCCCCC" w:sz="1"/>
-            </w:tcBorders>
-            <w:tcMar>
-              <w:top w:type="dxa" w:w="80"/>
-              <w:left w:type="dxa" w:w="120"/>
-              <w:bottom w:type="dxa" w:w="80"/>
-              <w:right w:type="dxa" w:w="120"/>
-            </w:tcMar>
-          </w:tcPr>
-          <w:p>
-            <w:r>
-              <w:rPr>
-                <w:rFonts w:ascii="Consolas" w:cs="Consolas" w:eastAsia="Consolas" w:hAnsi="Consolas"/>
-              </w:rPr>
-              <w:t xml:space="preserve">/noahApi/common/dealtype/select</w:t>
-            </w:r>
-            <w:r>
-              <w:rPr>
-                <w:rFonts w:ascii="Arial" w:eastAsia="Microsoft YaHei"/>
-              </w:rPr>
-              <w:t xml:space="preserve"> 获取处置类型</w:t>
-            </w:r>
-          </w:p>
-        </w:tc>
-        <w:tc>
-          <w:tcPr>
-            <w:tcW w:type="dxa" w:w="4513"/>
-            <w:tcBorders>
-              <w:top w:val="single" w:color="CCCCCC" w:sz="1"/>
-              <w:left w:val="single" w:color="CCCCCC" w:sz="1"/>
-              <w:bottom w:val="single" w:color="CCCCCC" w:sz="1"/>
-              <w:right w:val="single" w:color="CCCCCC" w:sz="1"/>
-            </w:tcBorders>
-            <w:tcMar>
-              <w:top w:type="dxa" w:w="80"/>
-              <w:left w:type="dxa" w:w="120"/>
-              <w:bottom w:type="dxa" w:w="80"/>
-              <w:right w:type="dxa" w:w="120"/>
-            </w:tcMar>
-          </w:tcPr>
-          <w:p>
-            <w:r>
-              <w:rPr>
-                <w:rFonts w:ascii="Consolas" w:cs="Consolas" w:eastAsia="Consolas" w:hAnsi="Consolas"/>
-              </w:rPr>
-              <w:t xml:space="preserve">tiance.search_entities(type="deal_type")</w:t>
-            </w:r>
-          </w:p>
-        </w:tc>
-      </w:tr>
-      <w:tr>
-        <w:tc>
-          <w:tcPr>
-            <w:tcW w:type="dxa" w:w="4513"/>
-            <w:tcBorders>
-              <w:top w:val="single" w:color="CCCCCC" w:sz="1"/>
-              <w:left w:val="single" w:color="CCCCCC" w:sz="1"/>
-              <w:bottom w:val="single" w:color="CCCCCC" w:sz="1"/>
-              <w:right w:val="single" w:color="CCCCCC" w:sz="1"/>
-            </w:tcBorders>
-            <w:tcMar>
-              <w:top w:type="dxa" w:w="80"/>
-              <w:left w:type="dxa" w:w="120"/>
-              <w:bottom w:type="dxa" w:w="80"/>
-              <w:right w:type="dxa" w:w="120"/>
-            </w:tcMar>
-          </w:tcPr>
-          <w:p>
-            <w:r>
-              <w:rPr>
-                <w:rFonts w:ascii="Consolas" w:cs="Consolas" w:eastAsia="Consolas" w:hAnsi="Consolas"/>
-              </w:rPr>
-              <w:t xml:space="preserve">/bridgeApi/dictionary/list</w:t>
-            </w:r>
-            <w:r>
-              <w:rPr>
-                <w:rFonts w:ascii="Arial" w:eastAsia="Microsoft YaHei"/>
-              </w:rPr>
-              <w:t xml:space="preserve"> 获取事件类型/风险类型字典</w:t>
-            </w:r>
-          </w:p>
-        </w:tc>
-        <w:tc>
-          <w:tcPr>
-            <w:tcW w:type="dxa" w:w="4513"/>
-            <w:tcBorders>
-              <w:top w:val="single" w:color="CCCCCC" w:sz="1"/>
-              <w:left w:val="single" w:color="CCCCCC" w:sz="1"/>
-              <w:bottom w:val="single" w:color="CCCCCC" w:sz="1"/>
-              <w:right w:val="single" w:color="CCCCCC" w:sz="1"/>
-            </w:tcBorders>
-            <w:tcMar>
-              <w:top w:type="dxa" w:w="80"/>
-              <w:left w:type="dxa" w:w="120"/>
-              <w:bottom w:type="dxa" w:w="80"/>
-              <w:right w:type="dxa" w:w="120"/>
-            </w:tcMar>
-          </w:tcPr>
-          <w:p>
-            <w:r>
-              <w:rPr>
-                <w:rFonts w:ascii="Consolas" w:cs="Consolas" w:eastAsia="Consolas" w:hAnsi="Consolas"/>
-              </w:rPr>
-              <w:t xml:space="preserve">tiance.search_entities(type="dictionary", key="事件类型")</w:t>
-            </w:r>
-          </w:p>
-        </w:tc>
-      </w:tr>
-      <w:tr>
-        <w:tc>
-          <w:tcPr>
-            <w:tcW w:type="dxa" w:w="4513"/>
-            <w:tcBorders>
-              <w:top w:val="single" w:color="CCCCCC" w:sz="1"/>
-              <w:left w:val="single" w:color="CCCCCC" w:sz="1"/>
-              <w:bottom w:val="single" w:color="CCCCCC" w:sz="1"/>
-              <w:right w:val="single" w:color="CCCCCC" w:sz="1"/>
-            </w:tcBorders>
-            <w:tcMar>
-              <w:top w:type="dxa" w:w="80"/>
-              <w:left w:type="dxa" w:w="120"/>
-              <w:bottom w:type="dxa" w:w="80"/>
-              <w:right w:type="dxa" w:w="120"/>
-            </w:tcMar>
-          </w:tcPr>
-          <w:p>
-            <w:r>
-              <w:rPr>
-                <w:rFonts w:ascii="Consolas" w:cs="Consolas" w:eastAsia="Consolas" w:hAnsi="Consolas"/>
-              </w:rPr>
-              <w:t xml:space="preserve">/tradeApi/allMap</w:t>
-            </w:r>
-            <w:r>
-              <w:rPr>
-                <w:rFonts w:ascii="Arial" w:eastAsia="Microsoft YaHei"/>
-              </w:rPr>
-              <w:t xml:space="preserve"> 获取综合映射表</w:t>
-            </w:r>
-          </w:p>
-        </w:tc>
-        <w:tc>
-          <w:tcPr>
-            <w:tcW w:type="dxa" w:w="4513"/>
-            <w:tcBorders>
-              <w:top w:val="single" w:color="CCCCCC" w:sz="1"/>
-              <w:left w:val="single" w:color="CCCCCC" w:sz="1"/>
-              <w:bottom w:val="single" w:color="CCCCCC" w:sz="1"/>
-              <w:right w:val="single" w:color="CCCCCC" w:sz="1"/>
-            </w:tcBorders>
-            <w:tcMar>
-              <w:top w:type="dxa" w:w="80"/>
-              <w:left w:type="dxa" w:w="120"/>
-              <w:bottom w:type="dxa" w:w="80"/>
-              <w:right w:type="dxa" w:w="120"/>
-            </w:tcMar>
-          </w:tcPr>
-          <w:p>
-            <w:r>
-              <w:rPr>
-                <w:rFonts w:ascii="Consolas" w:cs="Consolas" w:eastAsia="Consolas" w:hAnsi="Consolas"/>
-              </w:rPr>
-              <w:t xml:space="preserve">tiance.get_schema(type="trade_mapping")</w:t>
-            </w:r>
-          </w:p>
-        </w:tc>
-      </w:tr>
-      <w:tr>
-        <w:tc>
-          <w:tcPr>
-            <w:tcW w:type="dxa" w:w="4513"/>
-            <w:tcBorders>
-              <w:top w:val="single" w:color="CCCCCC" w:sz="1"/>
-              <w:left w:val="single" w:color="CCCCCC" w:sz="1"/>
-              <w:bottom w:val="single" w:color="CCCCCC" w:sz="1"/>
-              <w:right w:val="single" w:color="CCCCCC" w:sz="1"/>
-            </w:tcBorders>
-            <w:tcMar>
-              <w:top w:type="dxa" w:w="80"/>
-              <w:left w:type="dxa" w:w="120"/>
-              <w:bottom w:type="dxa" w:w="80"/>
-              <w:right w:type="dxa" w:w="120"/>
-            </w:tcMar>
-          </w:tcPr>
-          <w:p>
-            <w:r>
-              <w:rPr>
-                <w:rFonts w:ascii="Consolas" w:cs="Consolas" w:eastAsia="Consolas" w:hAnsi="Consolas"/>
-              </w:rPr>
-              <w:t xml:space="preserve">/noahApi/admin/template/all</w:t>
-            </w:r>
-            <w:r>
-              <w:rPr>
-                <w:rFonts w:ascii="Arial" w:eastAsia="Microsoft YaHei"/>
-              </w:rPr>
-              <w:t xml:space="preserve"> 获取规则/指标模板</w:t>
-            </w:r>
-          </w:p>
-        </w:tc>
-        <w:tc>
-          <w:tcPr>
-            <w:tcW w:type="dxa" w:w="4513"/>
-            <w:tcBorders>
-              <w:top w:val="single" w:color="CCCCCC" w:sz="1"/>
-              <w:left w:val="single" w:color="CCCCCC" w:sz="1"/>
-              <w:bottom w:val="single" w:color="CCCCCC" w:sz="1"/>
-              <w:right w:val="single" w:color="CCCCCC" w:sz="1"/>
-            </w:tcBorders>
-            <w:tcMar>
-              <w:top w:type="dxa" w:w="80"/>
-              <w:left w:type="dxa" w:w="120"/>
-              <w:bottom w:type="dxa" w:w="80"/>
-              <w:right w:type="dxa" w:w="120"/>
-            </w:tcMar>
-          </w:tcPr>
-          <w:p>
-            <w:r>
-              <w:rPr>
-                <w:rFonts w:ascii="Consolas" w:cs="Consolas" w:eastAsia="Consolas" w:hAnsi="Consolas"/>
-              </w:rPr>
-              <w:t xml:space="preserve">tiance.search_entities(type="rule_template")</w:t>
-            </w:r>
-          </w:p>
-        </w:tc>
-      </w:tr>
-      <w:tr>
-        <w:tc>
-          <w:tcPr>
-            <w:tcW w:type="dxa" w:w="4513"/>
-            <w:tcBorders>
-              <w:top w:val="single" w:color="CCCCCC" w:sz="1"/>
-              <w:left w:val="single" w:color="CCCCCC" w:sz="1"/>
-              <w:bottom w:val="single" w:color="CCCCCC" w:sz="1"/>
-              <w:right w:val="single" w:color="CCCCCC" w:sz="1"/>
-            </w:tcBorders>
-            <w:tcMar>
-              <w:top w:type="dxa" w:w="80"/>
-              <w:left w:type="dxa" w:w="120"/>
-              <w:bottom w:type="dxa" w:w="80"/>
-              <w:right w:type="dxa" w:w="120"/>
-            </w:tcMar>
-          </w:tcPr>
-          <w:p>
-            <w:r>
-              <w:rPr>
-                <w:rFonts w:ascii="Consolas" w:cs="Consolas" w:eastAsia="Consolas" w:hAnsi="Consolas"/>
-              </w:rPr>
-              <w:t xml:space="preserve">/indexApi/metricManagement/list</w:t>
-            </w:r>
-            <w:r>
-              <w:rPr>
-                <w:rFonts w:ascii="Arial" w:eastAsia="Microsoft YaHei"/>
-              </w:rPr>
-              <w:t xml:space="preserve"> 分页拉取指标配置</w:t>
-            </w:r>
-          </w:p>
-        </w:tc>
-        <w:tc>
-          <w:tcPr>
-            <w:tcW w:type="dxa" w:w="4513"/>
-            <w:tcBorders>
-              <w:top w:val="single" w:color="CCCCCC" w:sz="1"/>
-              <w:left w:val="single" w:color="CCCCCC" w:sz="1"/>
-              <w:bottom w:val="single" w:color="CCCCCC" w:sz="1"/>
-              <w:right w:val="single" w:color="CCCCCC" w:sz="1"/>
-            </w:tcBorders>
-            <w:tcMar>
-              <w:top w:type="dxa" w:w="80"/>
-              <w:left w:type="dxa" w:w="120"/>
-              <w:bottom w:type="dxa" w:w="80"/>
-              <w:right w:type="dxa" w:w="120"/>
-            </w:tcMar>
-          </w:tcPr>
-          <w:p>
-            <w:r>
-              <w:rPr>
-                <w:rFonts w:ascii="Consolas" w:cs="Consolas" w:eastAsia="Consolas" w:hAnsi="Consolas"/>
-              </w:rPr>
-              <w:t xml:space="preserve">tiance.search_entities(type="metric", area="RUNNING")</w:t>
-            </w:r>
-          </w:p>
-        </w:tc>
-      </w:tr>
-      <w:tr>
-        <w:tc>
-          <w:tcPr>
-            <w:tcW w:type="dxa" w:w="4513"/>
-            <w:tcBorders>
-              <w:top w:val="single" w:color="CCCCCC" w:sz="1"/>
-              <w:left w:val="single" w:color="CCCCCC" w:sz="1"/>
-              <w:bottom w:val="single" w:color="CCCCCC" w:sz="1"/>
-              <w:right w:val="single" w:color="CCCCCC" w:sz="1"/>
-            </w:tcBorders>
-            <w:tcMar>
-              <w:top w:type="dxa" w:w="80"/>
-              <w:left w:type="dxa" w:w="120"/>
-              <w:bottom w:type="dxa" w:w="80"/>
-              <w:right w:type="dxa" w:w="120"/>
-            </w:tcMar>
-          </w:tcPr>
-          <w:p>
-            <w:r>
-              <w:rPr>
-                <w:rFonts w:ascii="Arial" w:eastAsia="Microsoft YaHei"/>
-              </w:rPr>
-              <w:t xml:space="preserve">roster 系列端点（分组→名单→数据三级嵌套拉取）</w:t>
-            </w:r>
-          </w:p>
-        </w:tc>
-        <w:tc>
-          <w:tcPr>
-            <w:tcW w:type="dxa" w:w="4513"/>
-            <w:tcBorders>
-              <w:top w:val="single" w:color="CCCCCC" w:sz="1"/>
-              <w:left w:val="single" w:color="CCCCCC" w:sz="1"/>
-              <w:bottom w:val="single" w:color="CCCCCC" w:sz="1"/>
-              <w:right w:val="single" w:color="CCCCCC" w:sz="1"/>
-            </w:tcBorders>
-            <w:tcMar>
-              <w:top w:type="dxa" w:w="80"/>
-              <w:left w:type="dxa" w:w="120"/>
-              <w:bottom w:type="dxa" w:w="80"/>
-              <w:right w:type="dxa" w:w="120"/>
-            </w:tcMar>
-          </w:tcPr>
-          <w:p>
-            <w:r>
-              <w:rPr>
-                <w:rFonts w:ascii="Consolas" w:cs="Consolas" w:eastAsia="Consolas" w:hAnsi="Consolas"/>
-              </w:rPr>
-              <w:t xml:space="preserve">tiance.search_entities(type="roster")</w:t>
+                <w:rFonts w:ascii="Arial" w:eastAsia="Microsoft YaHei"/>
+              </w:rPr>
+              <w:t xml:space="preserve">类别 F：规则集分页 + 规则详情逐条拉取</w:t>
+            </w:r>
+          </w:p>
+        </w:tc>
+        <w:tc>
+          <w:tcPr>
+            <w:tcW w:type="dxa" w:w="4513"/>
+            <w:tcBorders>
+              <w:top w:val="single" w:color="CCCCCC" w:sz="1"/>
+              <w:left w:val="single" w:color="CCCCCC" w:sz="1"/>
+              <w:bottom w:val="single" w:color="CCCCCC" w:sz="1"/>
+              <w:right w:val="single" w:color="CCCCCC" w:sz="1"/>
+            </w:tcBorders>
+            <w:tcMar>
+              <w:top w:type="dxa" w:w="80"/>
+              <w:left w:type="dxa" w:w="120"/>
+              <w:bottom w:type="dxa" w:w="80"/>
+              <w:right w:type="dxa" w:w="120"/>
+            </w:tcMar>
+          </w:tcPr>
+          <w:p>
+            <w:r>
+              <w:rPr>
+                <w:rFonts w:ascii="Consolas" w:cs="Consolas" w:eastAsia="Consolas" w:hAnsi="Consolas"/>
+              </w:rPr>
+              <w:t xml:space="preserve">tiance.search_entities(type="ruleset")</w:t>
             </w:r>
             <w:r>
               <w:rPr>
@@ -698,183 +210,593 @@
               <w:rPr>
                 <w:rFonts w:ascii="Consolas" w:cs="Consolas" w:eastAsia="Consolas" w:hAnsi="Consolas"/>
               </w:rPr>
-              <w:t xml:space="preserve">tiance.get_entity()</w:t>
-            </w:r>
-          </w:p>
-        </w:tc>
-      </w:tr>
-      <w:tr>
-        <w:tc>
-          <w:tcPr>
-            <w:tcW w:type="dxa" w:w="4513"/>
-            <w:tcBorders>
-              <w:top w:val="single" w:color="CCCCCC" w:sz="1"/>
-              <w:left w:val="single" w:color="CCCCCC" w:sz="1"/>
-              <w:bottom w:val="single" w:color="CCCCCC" w:sz="1"/>
-              <w:right w:val="single" w:color="CCCCCC" w:sz="1"/>
-            </w:tcBorders>
-            <w:tcMar>
-              <w:top w:type="dxa" w:w="80"/>
-              <w:left w:type="dxa" w:w="120"/>
-              <w:bottom w:type="dxa" w:w="80"/>
-              <w:right w:type="dxa" w:w="120"/>
-            </w:tcMar>
-          </w:tcPr>
-          <w:p>
-            <w:r>
-              <w:rPr>
-                <w:rFonts w:ascii="Arial" w:eastAsia="Microsoft YaHei"/>
-              </w:rPr>
-              <w:t xml:space="preserve">CSRF token 提取和注入</w:t>
-            </w:r>
-          </w:p>
-        </w:tc>
-        <w:tc>
-          <w:tcPr>
-            <w:tcW w:type="dxa" w:w="4513"/>
-            <w:tcBorders>
-              <w:top w:val="single" w:color="CCCCCC" w:sz="1"/>
-              <w:left w:val="single" w:color="CCCCCC" w:sz="1"/>
-              <w:bottom w:val="single" w:color="CCCCCC" w:sz="1"/>
-              <w:right w:val="single" w:color="CCCCCC" w:sz="1"/>
-            </w:tcBorders>
-            <w:tcMar>
-              <w:top w:type="dxa" w:w="80"/>
-              <w:left w:type="dxa" w:w="120"/>
-              <w:bottom w:type="dxa" w:w="80"/>
-              <w:right w:type="dxa" w:w="120"/>
-            </w:tcMar>
-          </w:tcPr>
-          <w:p>
-            <w:r>
-              <w:rPr>
-                <w:rFonts w:ascii="Arial" w:eastAsia="Microsoft YaHei"/>
-              </w:rPr>
-              <w:t xml:space="preserve">MCP 身份层完全接管，不再需要</w:t>
-            </w:r>
-          </w:p>
-        </w:tc>
-      </w:tr>
-      <w:tr>
-        <w:tc>
-          <w:tcPr>
-            <w:tcW w:type="dxa" w:w="4513"/>
-            <w:tcBorders>
-              <w:top w:val="single" w:color="CCCCCC" w:sz="1"/>
-              <w:left w:val="single" w:color="CCCCCC" w:sz="1"/>
-              <w:bottom w:val="single" w:color="CCCCCC" w:sz="1"/>
-              <w:right w:val="single" w:color="CCCCCC" w:sz="1"/>
-            </w:tcBorders>
-            <w:tcMar>
-              <w:top w:type="dxa" w:w="80"/>
-              <w:left w:type="dxa" w:w="120"/>
-              <w:bottom w:type="dxa" w:w="80"/>
-              <w:right w:type="dxa" w:w="120"/>
-            </w:tcMar>
-          </w:tcPr>
-          <w:p>
-            <w:r>
-              <w:rPr>
-                <w:rFonts w:ascii="Consolas" w:cs="Consolas" w:eastAsia="Consolas" w:hAnsi="Consolas"/>
-              </w:rPr>
-              <w:t xml:space="preserve">window.__d</w:t>
-            </w:r>
-            <w:r>
-              <w:rPr>
-                <w:rFonts w:ascii="Arial" w:eastAsia="Microsoft YaHei"/>
-              </w:rPr>
-              <w:t xml:space="preserve"> 全局累积和 HTTP 回传</w:t>
-            </w:r>
-          </w:p>
-        </w:tc>
-        <w:tc>
-          <w:tcPr>
-            <w:tcW w:type="dxa" w:w="4513"/>
-            <w:tcBorders>
-              <w:top w:val="single" w:color="CCCCCC" w:sz="1"/>
-              <w:left w:val="single" w:color="CCCCCC" w:sz="1"/>
-              <w:bottom w:val="single" w:color="CCCCCC" w:sz="1"/>
-              <w:right w:val="single" w:color="CCCCCC" w:sz="1"/>
-            </w:tcBorders>
-            <w:tcMar>
-              <w:top w:type="dxa" w:w="80"/>
-              <w:left w:type="dxa" w:w="120"/>
-              <w:bottom w:type="dxa" w:w="80"/>
-              <w:right w:type="dxa" w:w="120"/>
-            </w:tcMar>
-          </w:tcPr>
-          <w:p>
-            <w:r>
-              <w:rPr>
-                <w:rFonts w:ascii="Arial" w:eastAsia="Microsoft YaHei"/>
-              </w:rPr>
-              <w:t xml:space="preserve">MCP 直接返回结构化 JSON，不再需要</w:t>
-            </w:r>
-          </w:p>
-        </w:tc>
-      </w:tr>
-      <w:tr>
-        <w:tc>
-          <w:tcPr>
-            <w:tcW w:type="dxa" w:w="4513"/>
-            <w:tcBorders>
-              <w:top w:val="single" w:color="CCCCCC" w:sz="1"/>
-              <w:left w:val="single" w:color="CCCCCC" w:sz="1"/>
-              <w:bottom w:val="single" w:color="CCCCCC" w:sz="1"/>
-              <w:right w:val="single" w:color="CCCCCC" w:sz="1"/>
-            </w:tcBorders>
-            <w:tcMar>
-              <w:top w:type="dxa" w:w="80"/>
-              <w:left w:type="dxa" w:w="120"/>
-              <w:bottom w:type="dxa" w:w="80"/>
-              <w:right w:type="dxa" w:w="120"/>
-            </w:tcMar>
-          </w:tcPr>
-          <w:p>
-            <w:r>
-              <w:rPr>
-                <w:rFonts w:ascii="Arial" w:eastAsia="Microsoft YaHei"/>
-              </w:rPr>
-              <w:t xml:space="preserve">手动模式 data</w:t>
-            </w:r>
-            <w:r>
-              <w:rPr>
-                <w:rFonts w:ascii="Arial" w:eastAsia="Microsoft YaHei"/>
-                <w:i/>
-                <w:iCs/>
-              </w:rPr>
-              <w:t xml:space="preserve">receiver</w:t>
-            </w:r>
-            <w:r>
-              <w:rPr>
-                <w:rFonts w:ascii="Arial" w:eastAsia="Microsoft YaHei"/>
-              </w:rPr>
-              <w:t xml:space="preserve">server.py</w:t>
-            </w:r>
-          </w:p>
-        </w:tc>
-        <w:tc>
-          <w:tcPr>
-            <w:tcW w:type="dxa" w:w="4513"/>
-            <w:tcBorders>
-              <w:top w:val="single" w:color="CCCCCC" w:sz="1"/>
-              <w:left w:val="single" w:color="CCCCCC" w:sz="1"/>
-              <w:bottom w:val="single" w:color="CCCCCC" w:sz="1"/>
-              <w:right w:val="single" w:color="CCCCCC" w:sz="1"/>
-            </w:tcBorders>
-            <w:tcMar>
-              <w:top w:type="dxa" w:w="80"/>
-              <w:left w:type="dxa" w:w="120"/>
-              <w:bottom w:type="dxa" w:w="80"/>
-              <w:right w:type="dxa" w:w="120"/>
-            </w:tcMar>
-          </w:tcPr>
-          <w:p>
-            <w:r>
-              <w:rPr>
-                <w:rFonts w:ascii="Arial" w:eastAsia="Microsoft YaHei"/>
-              </w:rPr>
-              <w:t xml:space="preserve">MCP 连接后完全废弃</w:t>
+              <w:t xml:space="preserve">tiance.get_entity(type="rule", id=...)</w:t>
+            </w:r>
+          </w:p>
+        </w:tc>
+      </w:tr>
+      <w:tr>
+        <w:tc>
+          <w:tcPr>
+            <w:tcW w:type="dxa" w:w="4513"/>
+            <w:tcBorders>
+              <w:top w:val="single" w:color="CCCCCC" w:sz="1"/>
+              <w:left w:val="single" w:color="CCCCCC" w:sz="1"/>
+              <w:bottom w:val="single" w:color="CCCCCC" w:sz="1"/>
+              <w:right w:val="single" w:color="CCCCCC" w:sz="1"/>
+            </w:tcBorders>
+            <w:tcMar>
+              <w:top w:type="dxa" w:w="80"/>
+              <w:left w:type="dxa" w:w="120"/>
+              <w:bottom w:type="dxa" w:w="80"/>
+              <w:right w:type="dxa" w:w="120"/>
+            </w:tcMar>
+          </w:tcPr>
+          <w:p>
+            <w:r>
+              <w:rPr>
+                <w:rFonts w:ascii="Arial" w:eastAsia="Microsoft YaHei"/>
+              </w:rPr>
+              <w:t xml:space="preserve">类别 G：策略分页 + 策略字典</w:t>
+            </w:r>
+          </w:p>
+        </w:tc>
+        <w:tc>
+          <w:tcPr>
+            <w:tcW w:type="dxa" w:w="4513"/>
+            <w:tcBorders>
+              <w:top w:val="single" w:color="CCCCCC" w:sz="1"/>
+              <w:left w:val="single" w:color="CCCCCC" w:sz="1"/>
+              <w:bottom w:val="single" w:color="CCCCCC" w:sz="1"/>
+              <w:right w:val="single" w:color="CCCCCC" w:sz="1"/>
+            </w:tcBorders>
+            <w:tcMar>
+              <w:top w:type="dxa" w:w="80"/>
+              <w:left w:type="dxa" w:w="120"/>
+              <w:bottom w:type="dxa" w:w="80"/>
+              <w:right w:type="dxa" w:w="120"/>
+            </w:tcMar>
+          </w:tcPr>
+          <w:p>
+            <w:r>
+              <w:rPr>
+                <w:rFonts w:ascii="Consolas" w:cs="Consolas" w:eastAsia="Consolas" w:hAnsi="Consolas"/>
+              </w:rPr>
+              <w:t xml:space="preserve">tiance.search_entities(type="policy")</w:t>
+            </w:r>
+            <w:r>
+              <w:rPr>
+                <w:rFonts w:ascii="Arial" w:eastAsia="Microsoft YaHei"/>
+              </w:rPr>
+              <w:t xml:space="preserve"> + </w:t>
+            </w:r>
+            <w:r>
+              <w:rPr>
+                <w:rFonts w:ascii="Consolas" w:cs="Consolas" w:eastAsia="Consolas" w:hAnsi="Consolas"/>
+              </w:rPr>
+              <w:t xml:space="preserve">tiance.get_schema(type="policy_dict")</w:t>
+            </w:r>
+          </w:p>
+        </w:tc>
+      </w:tr>
+      <w:tr>
+        <w:tc>
+          <w:tcPr>
+            <w:tcW w:type="dxa" w:w="4513"/>
+            <w:tcBorders>
+              <w:top w:val="single" w:color="CCCCCC" w:sz="1"/>
+              <w:left w:val="single" w:color="CCCCCC" w:sz="1"/>
+              <w:bottom w:val="single" w:color="CCCCCC" w:sz="1"/>
+              <w:right w:val="single" w:color="CCCCCC" w:sz="1"/>
+            </w:tcBorders>
+            <w:tcMar>
+              <w:top w:type="dxa" w:w="80"/>
+              <w:left w:type="dxa" w:w="120"/>
+              <w:bottom w:type="dxa" w:w="80"/>
+              <w:right w:type="dxa" w:w="120"/>
+            </w:tcMar>
+          </w:tcPr>
+          <w:p>
+            <w:r>
+              <w:rPr>
+                <w:rFonts w:ascii="Arial" w:eastAsia="Microsoft YaHei"/>
+              </w:rPr>
+              <w:t xml:space="preserve">类别 H：决策工具/函数/自定义函数</w:t>
+            </w:r>
+          </w:p>
+        </w:tc>
+        <w:tc>
+          <w:tcPr>
+            <w:tcW w:type="dxa" w:w="4513"/>
+            <w:tcBorders>
+              <w:top w:val="single" w:color="CCCCCC" w:sz="1"/>
+              <w:left w:val="single" w:color="CCCCCC" w:sz="1"/>
+              <w:bottom w:val="single" w:color="CCCCCC" w:sz="1"/>
+              <w:right w:val="single" w:color="CCCCCC" w:sz="1"/>
+            </w:tcBorders>
+            <w:tcMar>
+              <w:top w:type="dxa" w:w="80"/>
+              <w:left w:type="dxa" w:w="120"/>
+              <w:bottom w:type="dxa" w:w="80"/>
+              <w:right w:type="dxa" w:w="120"/>
+            </w:tcMar>
+          </w:tcPr>
+          <w:p>
+            <w:r>
+              <w:rPr>
+                <w:rFonts w:ascii="Consolas" w:cs="Consolas" w:eastAsia="Consolas" w:hAnsi="Consolas"/>
+              </w:rPr>
+              <w:t xml:space="preserve">tiance.search_entities(type="function")</w:t>
+            </w:r>
+            <w:r>
+              <w:rPr>
+                <w:rFonts w:ascii="Arial" w:eastAsia="Microsoft YaHei"/>
+              </w:rPr>
+              <w:t xml:space="preserve"> + </w:t>
+            </w:r>
+            <w:r>
+              <w:rPr>
+                <w:rFonts w:ascii="Consolas" w:cs="Consolas" w:eastAsia="Consolas" w:hAnsi="Consolas"/>
+              </w:rPr>
+              <w:t xml:space="preserve">tiance.get_entity(type="decision_tool")</w:t>
+            </w:r>
+          </w:p>
+        </w:tc>
+      </w:tr>
+      <w:tr>
+        <w:tc>
+          <w:tcPr>
+            <w:tcW w:type="dxa" w:w="4513"/>
+            <w:tcBorders>
+              <w:top w:val="single" w:color="CCCCCC" w:sz="1"/>
+              <w:left w:val="single" w:color="CCCCCC" w:sz="1"/>
+              <w:bottom w:val="single" w:color="CCCCCC" w:sz="1"/>
+              <w:right w:val="single" w:color="CCCCCC" w:sz="1"/>
+            </w:tcBorders>
+            <w:tcMar>
+              <w:top w:type="dxa" w:w="80"/>
+              <w:left w:type="dxa" w:w="120"/>
+              <w:bottom w:type="dxa" w:w="80"/>
+              <w:right w:type="dxa" w:w="120"/>
+            </w:tcMar>
+          </w:tcPr>
+          <w:p>
+            <w:r>
+              <w:rPr>
+                <w:rFonts w:ascii="Arial" w:eastAsia="Microsoft YaHei"/>
+              </w:rPr>
+              <w:t xml:space="preserve">类别 I：接口服务配置</w:t>
+            </w:r>
+          </w:p>
+        </w:tc>
+        <w:tc>
+          <w:tcPr>
+            <w:tcW w:type="dxa" w:w="4513"/>
+            <w:tcBorders>
+              <w:top w:val="single" w:color="CCCCCC" w:sz="1"/>
+              <w:left w:val="single" w:color="CCCCCC" w:sz="1"/>
+              <w:bottom w:val="single" w:color="CCCCCC" w:sz="1"/>
+              <w:right w:val="single" w:color="CCCCCC" w:sz="1"/>
+            </w:tcBorders>
+            <w:tcMar>
+              <w:top w:type="dxa" w:w="80"/>
+              <w:left w:type="dxa" w:w="120"/>
+              <w:bottom w:type="dxa" w:w="80"/>
+              <w:right w:type="dxa" w:w="120"/>
+            </w:tcMar>
+          </w:tcPr>
+          <w:p>
+            <w:r>
+              <w:rPr>
+                <w:rFonts w:ascii="Consolas" w:cs="Consolas" w:eastAsia="Consolas" w:hAnsi="Consolas"/>
+              </w:rPr>
+              <w:t xml:space="preserve">tiance.search_entities(type="service_config")</w:t>
+            </w:r>
+          </w:p>
+        </w:tc>
+      </w:tr>
+      <w:tr>
+        <w:tc>
+          <w:tcPr>
+            <w:tcW w:type="dxa" w:w="4513"/>
+            <w:tcBorders>
+              <w:top w:val="single" w:color="CCCCCC" w:sz="1"/>
+              <w:left w:val="single" w:color="CCCCCC" w:sz="1"/>
+              <w:bottom w:val="single" w:color="CCCCCC" w:sz="1"/>
+              <w:right w:val="single" w:color="CCCCCC" w:sz="1"/>
+            </w:tcBorders>
+            <w:tcMar>
+              <w:top w:type="dxa" w:w="80"/>
+              <w:left w:type="dxa" w:w="120"/>
+              <w:bottom w:type="dxa" w:w="80"/>
+              <w:right w:type="dxa" w:w="120"/>
+            </w:tcMar>
+          </w:tcPr>
+          <w:p>
+            <w:r>
+              <w:rPr>
+                <w:rFonts w:ascii="Arial" w:eastAsia="Microsoft YaHei"/>
+              </w:rPr>
+              <w:t xml:space="preserve">类别 K：三方数据（ETL/数据源/合作方/合同嵌套拉取）</w:t>
+            </w:r>
+          </w:p>
+        </w:tc>
+        <w:tc>
+          <w:tcPr>
+            <w:tcW w:type="dxa" w:w="4513"/>
+            <w:tcBorders>
+              <w:top w:val="single" w:color="CCCCCC" w:sz="1"/>
+              <w:left w:val="single" w:color="CCCCCC" w:sz="1"/>
+              <w:bottom w:val="single" w:color="CCCCCC" w:sz="1"/>
+              <w:right w:val="single" w:color="CCCCCC" w:sz="1"/>
+            </w:tcBorders>
+            <w:tcMar>
+              <w:top w:type="dxa" w:w="80"/>
+              <w:left w:type="dxa" w:w="120"/>
+              <w:bottom w:type="dxa" w:w="80"/>
+              <w:right w:type="dxa" w:w="120"/>
+            </w:tcMar>
+          </w:tcPr>
+          <w:p>
+            <w:r>
+              <w:rPr>
+                <w:rFonts w:ascii="Consolas" w:cs="Consolas" w:eastAsia="Consolas" w:hAnsi="Consolas"/>
+              </w:rPr>
+              <w:t xml:space="preserve">tiance.search_entities(type="etl_handler")</w:t>
+            </w:r>
+            <w:r>
+              <w:rPr>
+                <w:rFonts w:ascii="Arial" w:eastAsia="Microsoft YaHei"/>
+              </w:rPr>
+              <w:t xml:space="preserve"> + </w:t>
+            </w:r>
+            <w:r>
+              <w:rPr>
+                <w:rFonts w:ascii="Consolas" w:cs="Consolas" w:eastAsia="Consolas" w:hAnsi="Consolas"/>
+              </w:rPr>
+              <w:t xml:space="preserve">tiance.get_dependencies(type="service_provider")</w:t>
+            </w:r>
+          </w:p>
+        </w:tc>
+      </w:tr>
+      <w:tr>
+        <w:tc>
+          <w:tcPr>
+            <w:tcW w:type="dxa" w:w="4513"/>
+            <w:tcBorders>
+              <w:top w:val="single" w:color="CCCCCC" w:sz="1"/>
+              <w:left w:val="single" w:color="CCCCCC" w:sz="1"/>
+              <w:bottom w:val="single" w:color="CCCCCC" w:sz="1"/>
+              <w:right w:val="single" w:color="CCCCCC" w:sz="1"/>
+            </w:tcBorders>
+            <w:tcMar>
+              <w:top w:type="dxa" w:w="80"/>
+              <w:left w:type="dxa" w:w="120"/>
+              <w:bottom w:type="dxa" w:w="80"/>
+              <w:right w:type="dxa" w:w="120"/>
+            </w:tcMar>
+          </w:tcPr>
+          <w:p>
+            <w:r>
+              <w:rPr>
+                <w:rFonts w:ascii="Arial" w:eastAsia="Microsoft YaHei"/>
+              </w:rPr>
+              <w:t xml:space="preserve">类别 L：预警信号四层嵌套（业务分类→分组→子分组→信号）</w:t>
+            </w:r>
+          </w:p>
+        </w:tc>
+        <w:tc>
+          <w:tcPr>
+            <w:tcW w:type="dxa" w:w="4513"/>
+            <w:tcBorders>
+              <w:top w:val="single" w:color="CCCCCC" w:sz="1"/>
+              <w:left w:val="single" w:color="CCCCCC" w:sz="1"/>
+              <w:bottom w:val="single" w:color="CCCCCC" w:sz="1"/>
+              <w:right w:val="single" w:color="CCCCCC" w:sz="1"/>
+            </w:tcBorders>
+            <w:tcMar>
+              <w:top w:type="dxa" w:w="80"/>
+              <w:left w:type="dxa" w:w="120"/>
+              <w:bottom w:type="dxa" w:w="80"/>
+              <w:right w:type="dxa" w:w="120"/>
+            </w:tcMar>
+          </w:tcPr>
+          <w:p>
+            <w:r>
+              <w:rPr>
+                <w:rFonts w:ascii="Consolas" w:cs="Consolas" w:eastAsia="Consolas" w:hAnsi="Consolas"/>
+              </w:rPr>
+              <w:t xml:space="preserve">tiance.search_entities(type="alarm_signal")</w:t>
+            </w:r>
+            <w:r>
+              <w:rPr>
+                <w:rFonts w:ascii="Arial" w:eastAsia="Microsoft YaHei"/>
+              </w:rPr>
+              <w:t xml:space="preserve"> + </w:t>
+            </w:r>
+            <w:r>
+              <w:rPr>
+                <w:rFonts w:ascii="Consolas" w:cs="Consolas" w:eastAsia="Consolas" w:hAnsi="Consolas"/>
+              </w:rPr>
+              <w:t xml:space="preserve">tiance.get_schema(type="biz_category")</w:t>
+            </w:r>
+          </w:p>
+        </w:tc>
+      </w:tr>
+      <w:tr>
+        <w:tc>
+          <w:tcPr>
+            <w:tcW w:type="dxa" w:w="4513"/>
+            <w:tcBorders>
+              <w:top w:val="single" w:color="CCCCCC" w:sz="1"/>
+              <w:left w:val="single" w:color="CCCCCC" w:sz="1"/>
+              <w:bottom w:val="single" w:color="CCCCCC" w:sz="1"/>
+              <w:right w:val="single" w:color="CCCCCC" w:sz="1"/>
+            </w:tcBorders>
+            <w:tcMar>
+              <w:top w:type="dxa" w:w="80"/>
+              <w:left w:type="dxa" w:w="120"/>
+              <w:bottom w:type="dxa" w:w="80"/>
+              <w:right w:type="dxa" w:w="120"/>
+            </w:tcMar>
+          </w:tcPr>
+          <w:p>
+            <w:r>
+              <w:rPr>
+                <w:rFonts w:ascii="Arial" w:eastAsia="Microsoft YaHei"/>
+              </w:rPr>
+              <w:t xml:space="preserve">类别 M：Captain 外数（报文类型→模板→指标→指标包，分页协议各不相同）</w:t>
+            </w:r>
+          </w:p>
+        </w:tc>
+        <w:tc>
+          <w:tcPr>
+            <w:tcW w:type="dxa" w:w="4513"/>
+            <w:tcBorders>
+              <w:top w:val="single" w:color="CCCCCC" w:sz="1"/>
+              <w:left w:val="single" w:color="CCCCCC" w:sz="1"/>
+              <w:bottom w:val="single" w:color="CCCCCC" w:sz="1"/>
+              <w:right w:val="single" w:color="CCCCCC" w:sz="1"/>
+            </w:tcBorders>
+            <w:tcMar>
+              <w:top w:type="dxa" w:w="80"/>
+              <w:left w:type="dxa" w:w="120"/>
+              <w:bottom w:type="dxa" w:w="80"/>
+              <w:right w:type="dxa" w:w="120"/>
+            </w:tcMar>
+          </w:tcPr>
+          <w:p>
+            <w:r>
+              <w:rPr>
+                <w:rFonts w:ascii="Consolas" w:cs="Consolas" w:eastAsia="Consolas" w:hAnsi="Consolas"/>
+              </w:rPr>
+              <w:t xml:space="preserve">tiance.search_entities(type="captain_index")</w:t>
+            </w:r>
+          </w:p>
+        </w:tc>
+      </w:tr>
+      <w:tr>
+        <w:tc>
+          <w:tcPr>
+            <w:tcW w:type="dxa" w:w="4513"/>
+            <w:tcBorders>
+              <w:top w:val="single" w:color="CCCCCC" w:sz="1"/>
+              <w:left w:val="single" w:color="CCCCCC" w:sz="1"/>
+              <w:bottom w:val="single" w:color="CCCCCC" w:sz="1"/>
+              <w:right w:val="single" w:color="CCCCCC" w:sz="1"/>
+            </w:tcBorders>
+            <w:tcMar>
+              <w:top w:type="dxa" w:w="80"/>
+              <w:left w:type="dxa" w:w="120"/>
+              <w:bottom w:type="dxa" w:w="80"/>
+              <w:right w:type="dxa" w:w="120"/>
+            </w:tcMar>
+          </w:tcPr>
+          <w:p>
+            <w:r>
+              <w:rPr>
+                <w:rFonts w:ascii="Arial" w:eastAsia="Microsoft YaHei"/>
+              </w:rPr>
+              <w:t xml:space="preserve">Gateway Proxy 模式 / </w:t>
+            </w:r>
+            <w:r>
+              <w:rPr>
+                <w:rFonts w:ascii="Consolas" w:cs="Consolas" w:eastAsia="Consolas" w:hAnsi="Consolas"/>
+              </w:rPr>
+              <w:t xml:space="preserve">tiance_proxy.py</w:t>
+            </w:r>
+          </w:p>
+        </w:tc>
+        <w:tc>
+          <w:tcPr>
+            <w:tcW w:type="dxa" w:w="4513"/>
+            <w:tcBorders>
+              <w:top w:val="single" w:color="CCCCCC" w:sz="1"/>
+              <w:left w:val="single" w:color="CCCCCC" w:sz="1"/>
+              <w:bottom w:val="single" w:color="CCCCCC" w:sz="1"/>
+              <w:right w:val="single" w:color="CCCCCC" w:sz="1"/>
+            </w:tcBorders>
+            <w:tcMar>
+              <w:top w:type="dxa" w:w="80"/>
+              <w:left w:type="dxa" w:w="120"/>
+              <w:bottom w:type="dxa" w:w="80"/>
+              <w:right w:type="dxa" w:w="120"/>
+            </w:tcMar>
+          </w:tcPr>
+          <w:p>
+            <w:r>
+              <w:rPr>
+                <w:rFonts w:ascii="Arial" w:eastAsia="Microsoft YaHei"/>
+              </w:rPr>
+              <w:t xml:space="preserve">MCP 的 OAuth 2.1 Bearer Token 替代</w:t>
+            </w:r>
+          </w:p>
+        </w:tc>
+      </w:tr>
+      <w:tr>
+        <w:tc>
+          <w:tcPr>
+            <w:tcW w:type="dxa" w:w="4513"/>
+            <w:tcBorders>
+              <w:top w:val="single" w:color="CCCCCC" w:sz="1"/>
+              <w:left w:val="single" w:color="CCCCCC" w:sz="1"/>
+              <w:bottom w:val="single" w:color="CCCCCC" w:sz="1"/>
+              <w:right w:val="single" w:color="CCCCCC" w:sz="1"/>
+            </w:tcBorders>
+            <w:tcMar>
+              <w:top w:type="dxa" w:w="80"/>
+              <w:left w:type="dxa" w:w="120"/>
+              <w:bottom w:type="dxa" w:w="80"/>
+              <w:right w:type="dxa" w:w="120"/>
+            </w:tcMar>
+          </w:tcPr>
+          <w:p>
+            <w:r>
+              <w:rPr>
+                <w:rFonts w:ascii="Arial" w:eastAsia="Microsoft YaHei"/>
+              </w:rPr>
+              <w:t xml:space="preserve">双嵌套响应格式 </w:t>
+            </w:r>
+            <w:r>
+              <w:rPr>
+                <w:rFonts w:ascii="Consolas" w:cs="Consolas" w:eastAsia="Consolas" w:hAnsi="Consolas"/>
+              </w:rPr>
+              <w:t xml:space="preserve">response["data"]["data"]</w:t>
+            </w:r>
+          </w:p>
+        </w:tc>
+        <w:tc>
+          <w:tcPr>
+            <w:tcW w:type="dxa" w:w="4513"/>
+            <w:tcBorders>
+              <w:top w:val="single" w:color="CCCCCC" w:sz="1"/>
+              <w:left w:val="single" w:color="CCCCCC" w:sz="1"/>
+              <w:bottom w:val="single" w:color="CCCCCC" w:sz="1"/>
+              <w:right w:val="single" w:color="CCCCCC" w:sz="1"/>
+            </w:tcBorders>
+            <w:tcMar>
+              <w:top w:type="dxa" w:w="80"/>
+              <w:left w:type="dxa" w:w="120"/>
+              <w:bottom w:type="dxa" w:w="80"/>
+              <w:right w:type="dxa" w:w="120"/>
+            </w:tcMar>
+          </w:tcPr>
+          <w:p>
+            <w:r>
+              <w:rPr>
+                <w:rFonts w:ascii="Arial" w:eastAsia="Microsoft YaHei"/>
+              </w:rPr>
+              <w:t xml:space="preserve">MCP 直接返回业务层数据</w:t>
+            </w:r>
+          </w:p>
+        </w:tc>
+      </w:tr>
+      <w:tr>
+        <w:tc>
+          <w:tcPr>
+            <w:tcW w:type="dxa" w:w="4513"/>
+            <w:tcBorders>
+              <w:top w:val="single" w:color="CCCCCC" w:sz="1"/>
+              <w:left w:val="single" w:color="CCCCCC" w:sz="1"/>
+              <w:bottom w:val="single" w:color="CCCCCC" w:sz="1"/>
+              <w:right w:val="single" w:color="CCCCCC" w:sz="1"/>
+            </w:tcBorders>
+            <w:tcMar>
+              <w:top w:type="dxa" w:w="80"/>
+              <w:left w:type="dxa" w:w="120"/>
+              <w:bottom w:type="dxa" w:w="80"/>
+              <w:right w:type="dxa" w:w="120"/>
+            </w:tcMar>
+          </w:tcPr>
+          <w:p>
+            <w:r>
+              <w:rPr>
+                <w:rFonts w:ascii="Consolas" w:cs="Consolas" w:eastAsia="Consolas" w:hAnsi="Consolas"/>
+              </w:rPr>
+              <w:t xml:space="preserve">X-Td-Signature</w:t>
+            </w:r>
+            <w:r>
+              <w:rPr>
+                <w:rFonts w:ascii="Arial" w:eastAsia="Microsoft YaHei"/>
+              </w:rPr>
+              <w:t xml:space="preserve"> 请求签名（uniteApi）</w:t>
+            </w:r>
+          </w:p>
+        </w:tc>
+        <w:tc>
+          <w:tcPr>
+            <w:tcW w:type="dxa" w:w="4513"/>
+            <w:tcBorders>
+              <w:top w:val="single" w:color="CCCCCC" w:sz="1"/>
+              <w:left w:val="single" w:color="CCCCCC" w:sz="1"/>
+              <w:bottom w:val="single" w:color="CCCCCC" w:sz="1"/>
+              <w:right w:val="single" w:color="CCCCCC" w:sz="1"/>
+            </w:tcBorders>
+            <w:tcMar>
+              <w:top w:type="dxa" w:w="80"/>
+              <w:left w:type="dxa" w:w="120"/>
+              <w:bottom w:type="dxa" w:w="80"/>
+              <w:right w:type="dxa" w:w="120"/>
+            </w:tcMar>
+          </w:tcPr>
+          <w:p>
+            <w:r>
+              <w:rPr>
+                <w:rFonts w:ascii="Arial" w:eastAsia="Microsoft YaHei"/>
+              </w:rPr>
+              <w:t xml:space="preserve">MCP 服务端内部处理</w:t>
+            </w:r>
+          </w:p>
+        </w:tc>
+      </w:tr>
+      <w:tr>
+        <w:tc>
+          <w:tcPr>
+            <w:tcW w:type="dxa" w:w="4513"/>
+            <w:tcBorders>
+              <w:top w:val="single" w:color="CCCCCC" w:sz="1"/>
+              <w:left w:val="single" w:color="CCCCCC" w:sz="1"/>
+              <w:bottom w:val="single" w:color="CCCCCC" w:sz="1"/>
+              <w:right w:val="single" w:color="CCCCCC" w:sz="1"/>
+            </w:tcBorders>
+            <w:tcMar>
+              <w:top w:type="dxa" w:w="80"/>
+              <w:left w:type="dxa" w:w="120"/>
+              <w:bottom w:type="dxa" w:w="80"/>
+              <w:right w:type="dxa" w:w="120"/>
+            </w:tcMar>
+          </w:tcPr>
+          <w:p>
+            <w:r>
+              <w:rPr>
+                <w:rFonts w:ascii="Arial" w:eastAsia="Microsoft YaHei"/>
+              </w:rPr>
+              <w:t xml:space="preserve">版本自检 / skill-sync 比对</w:t>
+            </w:r>
+          </w:p>
+        </w:tc>
+        <w:tc>
+          <w:tcPr>
+            <w:tcW w:type="dxa" w:w="4513"/>
+            <w:tcBorders>
+              <w:top w:val="single" w:color="CCCCCC" w:sz="1"/>
+              <w:left w:val="single" w:color="CCCCCC" w:sz="1"/>
+              <w:bottom w:val="single" w:color="CCCCCC" w:sz="1"/>
+              <w:right w:val="single" w:color="CCCCCC" w:sz="1"/>
+            </w:tcBorders>
+            <w:tcMar>
+              <w:top w:type="dxa" w:w="80"/>
+              <w:left w:type="dxa" w:w="120"/>
+              <w:bottom w:type="dxa" w:w="80"/>
+              <w:right w:type="dxa" w:w="120"/>
+            </w:tcMar>
+          </w:tcPr>
+          <w:p>
+            <w:r>
+              <w:rPr>
+                <w:rFonts w:ascii="Arial" w:eastAsia="Microsoft YaHei"/>
+              </w:rPr>
+              <w:t xml:space="preserve">不再需要（MCP 端维护版本）</w:t>
             </w:r>
           </w:p>
         </w:tc>
@@ -894,19 +816,19 @@
         <w:rPr>
           <w:rFonts w:ascii="Arial" w:eastAsia="Microsoft YaHei"/>
         </w:rPr>
-        <w:t xml:space="preserve">Skill 保留部分：无。此 skill 可完全废弃，MCP 的 </w:t>
+        <w:t xml:space="preserve">Skill 保留部分：极少。选择哪些类别的元数据属于"编排决策"，可由上层 skill 或 agent 直接通过 MCP 参数指定。类别间依赖警告（如 B 类单独拉取时枚举值不完整）可编码为 MCP 的 </w:t>
       </w:r>
       <w:r>
         <w:rPr>
           <w:rFonts w:ascii="Consolas" w:cs="Consolas" w:eastAsia="Consolas" w:hAnsi="Consolas"/>
         </w:rPr>
-        <w:t xml:space="preserve">export_metadata_snapshot</w:t>
+        <w:t xml:space="preserve">warnings</w:t>
       </w:r>
       <w:r>
         <w:rPr>
           <w:rFonts w:ascii="Arial" w:eastAsia="Microsoft YaHei"/>
         </w:rPr>
-        <w:t xml:space="preserve"> 可一次返回等价于当前 10 个 JSON 文件的完整快照。</w:t>
+        <w:t xml:space="preserve"> 返回。</w:t>
       </w:r>
     </w:p>
     <w:p>
@@ -917,792 +839,7 @@
         <w:rPr>
           <w:rFonts w:ascii="Arial" w:eastAsia="Microsoft YaHei"/>
         </w:rPr>
-        <w:t xml:space="preserve">2. tiance-metadata-scout（42 个端点 → MCP 元数据工具）</w:t>
-      </w:r>
-    </w:p>
-    <w:p>
-      <w:pPr>
-        <w:spacing w:after="120" w:line="360" w:lineRule="auto"/>
-        <w:ind w:firstLine="480"/>
-      </w:pPr>
-      <w:r>
-        <w:rPr>
-          <w:rFonts w:ascii="Arial" w:eastAsia="Microsoft YaHei"/>
-        </w:rPr>
-        <w:t xml:space="preserve">当前实现：tiance-metadata 的增强版，42 个端点分 13 类（A-M），支持 4 种连接模式（Gateway Proxy &gt; 原生浏览器 &gt; Puppeteer &gt; 手动），输出 25+ JSON 文件。</w:t>
-      </w:r>
-    </w:p>
-    <w:p>
-      <w:pPr>
-        <w:spacing w:after="120" w:line="360" w:lineRule="auto"/>
-        <w:ind w:firstLine="480"/>
-      </w:pPr>
-      <w:r>
-        <w:rPr>
-          <w:rFonts w:ascii="Arial" w:eastAsia="Microsoft YaHei"/>
-        </w:rPr>
-        <w:t xml:space="preserve">可下沉到 MCP 的部分（几乎全部）：</w:t>
-      </w:r>
-    </w:p>
-    <w:tbl>
-      <w:tblPr>
-        <w:tblW w:type="dxa" w:w="9026"/>
-        <w:tblBorders>
-          <w:top w:val="single" w:color="auto" w:sz="4"/>
-          <w:left w:val="single" w:color="auto" w:sz="4"/>
-          <w:bottom w:val="single" w:color="auto" w:sz="4"/>
-          <w:right w:val="single" w:color="auto" w:sz="4"/>
-          <w:insideH w:val="single" w:color="auto" w:sz="4"/>
-          <w:insideV w:val="single" w:color="auto" w:sz="4"/>
-        </w:tblBorders>
-      </w:tblPr>
-      <w:tblGrid>
-        <w:gridCol w:w="4513"/>
-        <w:gridCol w:w="4513"/>
-      </w:tblGrid>
-      <w:tr>
-        <w:tc>
-          <w:tcPr>
-            <w:tcW w:type="dxa" w:w="4513"/>
-            <w:tcBorders>
-              <w:top w:val="single" w:color="CCCCCC" w:sz="1"/>
-              <w:left w:val="single" w:color="CCCCCC" w:sz="1"/>
-              <w:bottom w:val="single" w:color="CCCCCC" w:sz="1"/>
-              <w:right w:val="single" w:color="CCCCCC" w:sz="1"/>
-            </w:tcBorders>
-            <w:shd w:fill="D5E8F0" w:val="clear"/>
-            <w:tcMar>
-              <w:top w:type="dxa" w:w="80"/>
-              <w:left w:type="dxa" w:w="120"/>
-              <w:bottom w:type="dxa" w:w="80"/>
-              <w:right w:type="dxa" w:w="120"/>
-            </w:tcMar>
-          </w:tcPr>
-          <w:p>
-            <w:r>
-              <w:rPr>
-                <w:rFonts w:ascii="Arial" w:eastAsia="Microsoft YaHei"/>
-              </w:rPr>
-              <w:t xml:space="preserve">当前逻辑</w:t>
-            </w:r>
-          </w:p>
-        </w:tc>
-        <w:tc>
-          <w:tcPr>
-            <w:tcW w:type="dxa" w:w="4513"/>
-            <w:tcBorders>
-              <w:top w:val="single" w:color="CCCCCC" w:sz="1"/>
-              <w:left w:val="single" w:color="CCCCCC" w:sz="1"/>
-              <w:bottom w:val="single" w:color="CCCCCC" w:sz="1"/>
-              <w:right w:val="single" w:color="CCCCCC" w:sz="1"/>
-            </w:tcBorders>
-            <w:shd w:fill="D5E8F0" w:val="clear"/>
-            <w:tcMar>
-              <w:top w:type="dxa" w:w="80"/>
-              <w:left w:type="dxa" w:w="120"/>
-              <w:bottom w:type="dxa" w:w="80"/>
-              <w:right w:type="dxa" w:w="120"/>
-            </w:tcMar>
-          </w:tcPr>
-          <w:p>
-            <w:r>
-              <w:rPr>
-                <w:rFonts w:ascii="Arial" w:eastAsia="Microsoft YaHei"/>
-              </w:rPr>
-              <w:t xml:space="preserve">对应 MCP 工具</w:t>
-            </w:r>
-          </w:p>
-        </w:tc>
-      </w:tr>
-      <w:tr>
-        <w:tc>
-          <w:tcPr>
-            <w:tcW w:type="dxa" w:w="4513"/>
-            <w:tcBorders>
-              <w:top w:val="single" w:color="CCCCCC" w:sz="1"/>
-              <w:left w:val="single" w:color="CCCCCC" w:sz="1"/>
-              <w:bottom w:val="single" w:color="CCCCCC" w:sz="1"/>
-              <w:right w:val="single" w:color="CCCCCC" w:sz="1"/>
-            </w:tcBorders>
-            <w:tcMar>
-              <w:top w:type="dxa" w:w="80"/>
-              <w:left w:type="dxa" w:w="120"/>
-              <w:bottom w:type="dxa" w:w="80"/>
-              <w:right w:type="dxa" w:w="120"/>
-            </w:tcMar>
-          </w:tcPr>
-          <w:p>
-            <w:r>
-              <w:rPr>
-                <w:rFonts w:ascii="Arial" w:eastAsia="Microsoft YaHei"/>
-              </w:rPr>
-              <w:t xml:space="preserve">类别 F：规则集分页 + 规则详情逐条拉取</w:t>
-            </w:r>
-          </w:p>
-        </w:tc>
-        <w:tc>
-          <w:tcPr>
-            <w:tcW w:type="dxa" w:w="4513"/>
-            <w:tcBorders>
-              <w:top w:val="single" w:color="CCCCCC" w:sz="1"/>
-              <w:left w:val="single" w:color="CCCCCC" w:sz="1"/>
-              <w:bottom w:val="single" w:color="CCCCCC" w:sz="1"/>
-              <w:right w:val="single" w:color="CCCCCC" w:sz="1"/>
-            </w:tcBorders>
-            <w:tcMar>
-              <w:top w:type="dxa" w:w="80"/>
-              <w:left w:type="dxa" w:w="120"/>
-              <w:bottom w:type="dxa" w:w="80"/>
-              <w:right w:type="dxa" w:w="120"/>
-            </w:tcMar>
-          </w:tcPr>
-          <w:p>
-            <w:r>
-              <w:rPr>
-                <w:rFonts w:ascii="Consolas" w:cs="Consolas" w:eastAsia="Consolas" w:hAnsi="Consolas"/>
-              </w:rPr>
-              <w:t xml:space="preserve">tiance.search_entities(type="ruleset")</w:t>
-            </w:r>
-            <w:r>
-              <w:rPr>
-                <w:rFonts w:ascii="Arial" w:eastAsia="Microsoft YaHei"/>
-              </w:rPr>
-              <w:t xml:space="preserve"> + </w:t>
-            </w:r>
-            <w:r>
-              <w:rPr>
-                <w:rFonts w:ascii="Consolas" w:cs="Consolas" w:eastAsia="Consolas" w:hAnsi="Consolas"/>
-              </w:rPr>
-              <w:t xml:space="preserve">tiance.get_entity(type="rule", id=...)</w:t>
-            </w:r>
-          </w:p>
-        </w:tc>
-      </w:tr>
-      <w:tr>
-        <w:tc>
-          <w:tcPr>
-            <w:tcW w:type="dxa" w:w="4513"/>
-            <w:tcBorders>
-              <w:top w:val="single" w:color="CCCCCC" w:sz="1"/>
-              <w:left w:val="single" w:color="CCCCCC" w:sz="1"/>
-              <w:bottom w:val="single" w:color="CCCCCC" w:sz="1"/>
-              <w:right w:val="single" w:color="CCCCCC" w:sz="1"/>
-            </w:tcBorders>
-            <w:tcMar>
-              <w:top w:type="dxa" w:w="80"/>
-              <w:left w:type="dxa" w:w="120"/>
-              <w:bottom w:type="dxa" w:w="80"/>
-              <w:right w:type="dxa" w:w="120"/>
-            </w:tcMar>
-          </w:tcPr>
-          <w:p>
-            <w:r>
-              <w:rPr>
-                <w:rFonts w:ascii="Arial" w:eastAsia="Microsoft YaHei"/>
-              </w:rPr>
-              <w:t xml:space="preserve">类别 G：策略分页 + 策略字典</w:t>
-            </w:r>
-          </w:p>
-        </w:tc>
-        <w:tc>
-          <w:tcPr>
-            <w:tcW w:type="dxa" w:w="4513"/>
-            <w:tcBorders>
-              <w:top w:val="single" w:color="CCCCCC" w:sz="1"/>
-              <w:left w:val="single" w:color="CCCCCC" w:sz="1"/>
-              <w:bottom w:val="single" w:color="CCCCCC" w:sz="1"/>
-              <w:right w:val="single" w:color="CCCCCC" w:sz="1"/>
-            </w:tcBorders>
-            <w:tcMar>
-              <w:top w:type="dxa" w:w="80"/>
-              <w:left w:type="dxa" w:w="120"/>
-              <w:bottom w:type="dxa" w:w="80"/>
-              <w:right w:type="dxa" w:w="120"/>
-            </w:tcMar>
-          </w:tcPr>
-          <w:p>
-            <w:r>
-              <w:rPr>
-                <w:rFonts w:ascii="Consolas" w:cs="Consolas" w:eastAsia="Consolas" w:hAnsi="Consolas"/>
-              </w:rPr>
-              <w:t xml:space="preserve">tiance.search_entities(type="policy")</w:t>
-            </w:r>
-            <w:r>
-              <w:rPr>
-                <w:rFonts w:ascii="Arial" w:eastAsia="Microsoft YaHei"/>
-              </w:rPr>
-              <w:t xml:space="preserve"> + </w:t>
-            </w:r>
-            <w:r>
-              <w:rPr>
-                <w:rFonts w:ascii="Consolas" w:cs="Consolas" w:eastAsia="Consolas" w:hAnsi="Consolas"/>
-              </w:rPr>
-              <w:t xml:space="preserve">tiance.get_schema(type="policy_dict")</w:t>
-            </w:r>
-          </w:p>
-        </w:tc>
-      </w:tr>
-      <w:tr>
-        <w:tc>
-          <w:tcPr>
-            <w:tcW w:type="dxa" w:w="4513"/>
-            <w:tcBorders>
-              <w:top w:val="single" w:color="CCCCCC" w:sz="1"/>
-              <w:left w:val="single" w:color="CCCCCC" w:sz="1"/>
-              <w:bottom w:val="single" w:color="CCCCCC" w:sz="1"/>
-              <w:right w:val="single" w:color="CCCCCC" w:sz="1"/>
-            </w:tcBorders>
-            <w:tcMar>
-              <w:top w:type="dxa" w:w="80"/>
-              <w:left w:type="dxa" w:w="120"/>
-              <w:bottom w:type="dxa" w:w="80"/>
-              <w:right w:type="dxa" w:w="120"/>
-            </w:tcMar>
-          </w:tcPr>
-          <w:p>
-            <w:r>
-              <w:rPr>
-                <w:rFonts w:ascii="Arial" w:eastAsia="Microsoft YaHei"/>
-              </w:rPr>
-              <w:t xml:space="preserve">类别 H：决策工具/函数/自定义函数</w:t>
-            </w:r>
-          </w:p>
-        </w:tc>
-        <w:tc>
-          <w:tcPr>
-            <w:tcW w:type="dxa" w:w="4513"/>
-            <w:tcBorders>
-              <w:top w:val="single" w:color="CCCCCC" w:sz="1"/>
-              <w:left w:val="single" w:color="CCCCCC" w:sz="1"/>
-              <w:bottom w:val="single" w:color="CCCCCC" w:sz="1"/>
-              <w:right w:val="single" w:color="CCCCCC" w:sz="1"/>
-            </w:tcBorders>
-            <w:tcMar>
-              <w:top w:type="dxa" w:w="80"/>
-              <w:left w:type="dxa" w:w="120"/>
-              <w:bottom w:type="dxa" w:w="80"/>
-              <w:right w:type="dxa" w:w="120"/>
-            </w:tcMar>
-          </w:tcPr>
-          <w:p>
-            <w:r>
-              <w:rPr>
-                <w:rFonts w:ascii="Consolas" w:cs="Consolas" w:eastAsia="Consolas" w:hAnsi="Consolas"/>
-              </w:rPr>
-              <w:t xml:space="preserve">tiance.search_entities(type="function")</w:t>
-            </w:r>
-            <w:r>
-              <w:rPr>
-                <w:rFonts w:ascii="Arial" w:eastAsia="Microsoft YaHei"/>
-              </w:rPr>
-              <w:t xml:space="preserve"> + </w:t>
-            </w:r>
-            <w:r>
-              <w:rPr>
-                <w:rFonts w:ascii="Consolas" w:cs="Consolas" w:eastAsia="Consolas" w:hAnsi="Consolas"/>
-              </w:rPr>
-              <w:t xml:space="preserve">tiance.get_entity(type="decision_tool")</w:t>
-            </w:r>
-          </w:p>
-        </w:tc>
-      </w:tr>
-      <w:tr>
-        <w:tc>
-          <w:tcPr>
-            <w:tcW w:type="dxa" w:w="4513"/>
-            <w:tcBorders>
-              <w:top w:val="single" w:color="CCCCCC" w:sz="1"/>
-              <w:left w:val="single" w:color="CCCCCC" w:sz="1"/>
-              <w:bottom w:val="single" w:color="CCCCCC" w:sz="1"/>
-              <w:right w:val="single" w:color="CCCCCC" w:sz="1"/>
-            </w:tcBorders>
-            <w:tcMar>
-              <w:top w:type="dxa" w:w="80"/>
-              <w:left w:type="dxa" w:w="120"/>
-              <w:bottom w:type="dxa" w:w="80"/>
-              <w:right w:type="dxa" w:w="120"/>
-            </w:tcMar>
-          </w:tcPr>
-          <w:p>
-            <w:r>
-              <w:rPr>
-                <w:rFonts w:ascii="Arial" w:eastAsia="Microsoft YaHei"/>
-              </w:rPr>
-              <w:t xml:space="preserve">类别 I：接口服务配置</w:t>
-            </w:r>
-          </w:p>
-        </w:tc>
-        <w:tc>
-          <w:tcPr>
-            <w:tcW w:type="dxa" w:w="4513"/>
-            <w:tcBorders>
-              <w:top w:val="single" w:color="CCCCCC" w:sz="1"/>
-              <w:left w:val="single" w:color="CCCCCC" w:sz="1"/>
-              <w:bottom w:val="single" w:color="CCCCCC" w:sz="1"/>
-              <w:right w:val="single" w:color="CCCCCC" w:sz="1"/>
-            </w:tcBorders>
-            <w:tcMar>
-              <w:top w:type="dxa" w:w="80"/>
-              <w:left w:type="dxa" w:w="120"/>
-              <w:bottom w:type="dxa" w:w="80"/>
-              <w:right w:type="dxa" w:w="120"/>
-            </w:tcMar>
-          </w:tcPr>
-          <w:p>
-            <w:r>
-              <w:rPr>
-                <w:rFonts w:ascii="Consolas" w:cs="Consolas" w:eastAsia="Consolas" w:hAnsi="Consolas"/>
-              </w:rPr>
-              <w:t xml:space="preserve">tiance.search_entities(type="service_config")</w:t>
-            </w:r>
-          </w:p>
-        </w:tc>
-      </w:tr>
-      <w:tr>
-        <w:tc>
-          <w:tcPr>
-            <w:tcW w:type="dxa" w:w="4513"/>
-            <w:tcBorders>
-              <w:top w:val="single" w:color="CCCCCC" w:sz="1"/>
-              <w:left w:val="single" w:color="CCCCCC" w:sz="1"/>
-              <w:bottom w:val="single" w:color="CCCCCC" w:sz="1"/>
-              <w:right w:val="single" w:color="CCCCCC" w:sz="1"/>
-            </w:tcBorders>
-            <w:tcMar>
-              <w:top w:type="dxa" w:w="80"/>
-              <w:left w:type="dxa" w:w="120"/>
-              <w:bottom w:type="dxa" w:w="80"/>
-              <w:right w:type="dxa" w:w="120"/>
-            </w:tcMar>
-          </w:tcPr>
-          <w:p>
-            <w:r>
-              <w:rPr>
-                <w:rFonts w:ascii="Arial" w:eastAsia="Microsoft YaHei"/>
-              </w:rPr>
-              <w:t xml:space="preserve">类别 K：三方数据（ETL/数据源/合作方/合同嵌套拉取）</w:t>
-            </w:r>
-          </w:p>
-        </w:tc>
-        <w:tc>
-          <w:tcPr>
-            <w:tcW w:type="dxa" w:w="4513"/>
-            <w:tcBorders>
-              <w:top w:val="single" w:color="CCCCCC" w:sz="1"/>
-              <w:left w:val="single" w:color="CCCCCC" w:sz="1"/>
-              <w:bottom w:val="single" w:color="CCCCCC" w:sz="1"/>
-              <w:right w:val="single" w:color="CCCCCC" w:sz="1"/>
-            </w:tcBorders>
-            <w:tcMar>
-              <w:top w:type="dxa" w:w="80"/>
-              <w:left w:type="dxa" w:w="120"/>
-              <w:bottom w:type="dxa" w:w="80"/>
-              <w:right w:type="dxa" w:w="120"/>
-            </w:tcMar>
-          </w:tcPr>
-          <w:p>
-            <w:r>
-              <w:rPr>
-                <w:rFonts w:ascii="Consolas" w:cs="Consolas" w:eastAsia="Consolas" w:hAnsi="Consolas"/>
-              </w:rPr>
-              <w:t xml:space="preserve">tiance.search_entities(type="etl_handler")</w:t>
-            </w:r>
-            <w:r>
-              <w:rPr>
-                <w:rFonts w:ascii="Arial" w:eastAsia="Microsoft YaHei"/>
-              </w:rPr>
-              <w:t xml:space="preserve"> + </w:t>
-            </w:r>
-            <w:r>
-              <w:rPr>
-                <w:rFonts w:ascii="Consolas" w:cs="Consolas" w:eastAsia="Consolas" w:hAnsi="Consolas"/>
-              </w:rPr>
-              <w:t xml:space="preserve">tiance.get_dependencies(type="service_provider")</w:t>
-            </w:r>
-          </w:p>
-        </w:tc>
-      </w:tr>
-      <w:tr>
-        <w:tc>
-          <w:tcPr>
-            <w:tcW w:type="dxa" w:w="4513"/>
-            <w:tcBorders>
-              <w:top w:val="single" w:color="CCCCCC" w:sz="1"/>
-              <w:left w:val="single" w:color="CCCCCC" w:sz="1"/>
-              <w:bottom w:val="single" w:color="CCCCCC" w:sz="1"/>
-              <w:right w:val="single" w:color="CCCCCC" w:sz="1"/>
-            </w:tcBorders>
-            <w:tcMar>
-              <w:top w:type="dxa" w:w="80"/>
-              <w:left w:type="dxa" w:w="120"/>
-              <w:bottom w:type="dxa" w:w="80"/>
-              <w:right w:type="dxa" w:w="120"/>
-            </w:tcMar>
-          </w:tcPr>
-          <w:p>
-            <w:r>
-              <w:rPr>
-                <w:rFonts w:ascii="Arial" w:eastAsia="Microsoft YaHei"/>
-              </w:rPr>
-              <w:t xml:space="preserve">类别 L：预警信号四层嵌套（业务分类→分组→子分组→信号）</w:t>
-            </w:r>
-          </w:p>
-        </w:tc>
-        <w:tc>
-          <w:tcPr>
-            <w:tcW w:type="dxa" w:w="4513"/>
-            <w:tcBorders>
-              <w:top w:val="single" w:color="CCCCCC" w:sz="1"/>
-              <w:left w:val="single" w:color="CCCCCC" w:sz="1"/>
-              <w:bottom w:val="single" w:color="CCCCCC" w:sz="1"/>
-              <w:right w:val="single" w:color="CCCCCC" w:sz="1"/>
-            </w:tcBorders>
-            <w:tcMar>
-              <w:top w:type="dxa" w:w="80"/>
-              <w:left w:type="dxa" w:w="120"/>
-              <w:bottom w:type="dxa" w:w="80"/>
-              <w:right w:type="dxa" w:w="120"/>
-            </w:tcMar>
-          </w:tcPr>
-          <w:p>
-            <w:r>
-              <w:rPr>
-                <w:rFonts w:ascii="Consolas" w:cs="Consolas" w:eastAsia="Consolas" w:hAnsi="Consolas"/>
-              </w:rPr>
-              <w:t xml:space="preserve">tiance.search_entities(type="alarm_signal")</w:t>
-            </w:r>
-            <w:r>
-              <w:rPr>
-                <w:rFonts w:ascii="Arial" w:eastAsia="Microsoft YaHei"/>
-              </w:rPr>
-              <w:t xml:space="preserve"> + </w:t>
-            </w:r>
-            <w:r>
-              <w:rPr>
-                <w:rFonts w:ascii="Consolas" w:cs="Consolas" w:eastAsia="Consolas" w:hAnsi="Consolas"/>
-              </w:rPr>
-              <w:t xml:space="preserve">tiance.get_schema(type="biz_category")</w:t>
-            </w:r>
-          </w:p>
-        </w:tc>
-      </w:tr>
-      <w:tr>
-        <w:tc>
-          <w:tcPr>
-            <w:tcW w:type="dxa" w:w="4513"/>
-            <w:tcBorders>
-              <w:top w:val="single" w:color="CCCCCC" w:sz="1"/>
-              <w:left w:val="single" w:color="CCCCCC" w:sz="1"/>
-              <w:bottom w:val="single" w:color="CCCCCC" w:sz="1"/>
-              <w:right w:val="single" w:color="CCCCCC" w:sz="1"/>
-            </w:tcBorders>
-            <w:tcMar>
-              <w:top w:type="dxa" w:w="80"/>
-              <w:left w:type="dxa" w:w="120"/>
-              <w:bottom w:type="dxa" w:w="80"/>
-              <w:right w:type="dxa" w:w="120"/>
-            </w:tcMar>
-          </w:tcPr>
-          <w:p>
-            <w:r>
-              <w:rPr>
-                <w:rFonts w:ascii="Arial" w:eastAsia="Microsoft YaHei"/>
-              </w:rPr>
-              <w:t xml:space="preserve">类别 M：Captain 外数（报文类型→模板→指标→指标包，分页协议各不相同）</w:t>
-            </w:r>
-          </w:p>
-        </w:tc>
-        <w:tc>
-          <w:tcPr>
-            <w:tcW w:type="dxa" w:w="4513"/>
-            <w:tcBorders>
-              <w:top w:val="single" w:color="CCCCCC" w:sz="1"/>
-              <w:left w:val="single" w:color="CCCCCC" w:sz="1"/>
-              <w:bottom w:val="single" w:color="CCCCCC" w:sz="1"/>
-              <w:right w:val="single" w:color="CCCCCC" w:sz="1"/>
-            </w:tcBorders>
-            <w:tcMar>
-              <w:top w:type="dxa" w:w="80"/>
-              <w:left w:type="dxa" w:w="120"/>
-              <w:bottom w:type="dxa" w:w="80"/>
-              <w:right w:type="dxa" w:w="120"/>
-            </w:tcMar>
-          </w:tcPr>
-          <w:p>
-            <w:r>
-              <w:rPr>
-                <w:rFonts w:ascii="Consolas" w:cs="Consolas" w:eastAsia="Consolas" w:hAnsi="Consolas"/>
-              </w:rPr>
-              <w:t xml:space="preserve">tiance.search_entities(type="captain_index")</w:t>
-            </w:r>
-          </w:p>
-        </w:tc>
-      </w:tr>
-      <w:tr>
-        <w:tc>
-          <w:tcPr>
-            <w:tcW w:type="dxa" w:w="4513"/>
-            <w:tcBorders>
-              <w:top w:val="single" w:color="CCCCCC" w:sz="1"/>
-              <w:left w:val="single" w:color="CCCCCC" w:sz="1"/>
-              <w:bottom w:val="single" w:color="CCCCCC" w:sz="1"/>
-              <w:right w:val="single" w:color="CCCCCC" w:sz="1"/>
-            </w:tcBorders>
-            <w:tcMar>
-              <w:top w:type="dxa" w:w="80"/>
-              <w:left w:type="dxa" w:w="120"/>
-              <w:bottom w:type="dxa" w:w="80"/>
-              <w:right w:type="dxa" w:w="120"/>
-            </w:tcMar>
-          </w:tcPr>
-          <w:p>
-            <w:r>
-              <w:rPr>
-                <w:rFonts w:ascii="Arial" w:eastAsia="Microsoft YaHei"/>
-              </w:rPr>
-              <w:t xml:space="preserve">Gateway Proxy 模式 / </w:t>
-            </w:r>
-            <w:r>
-              <w:rPr>
-                <w:rFonts w:ascii="Consolas" w:cs="Consolas" w:eastAsia="Consolas" w:hAnsi="Consolas"/>
-              </w:rPr>
-              <w:t xml:space="preserve">tiance_proxy.py</w:t>
-            </w:r>
-          </w:p>
-        </w:tc>
-        <w:tc>
-          <w:tcPr>
-            <w:tcW w:type="dxa" w:w="4513"/>
-            <w:tcBorders>
-              <w:top w:val="single" w:color="CCCCCC" w:sz="1"/>
-              <w:left w:val="single" w:color="CCCCCC" w:sz="1"/>
-              <w:bottom w:val="single" w:color="CCCCCC" w:sz="1"/>
-              <w:right w:val="single" w:color="CCCCCC" w:sz="1"/>
-            </w:tcBorders>
-            <w:tcMar>
-              <w:top w:type="dxa" w:w="80"/>
-              <w:left w:type="dxa" w:w="120"/>
-              <w:bottom w:type="dxa" w:w="80"/>
-              <w:right w:type="dxa" w:w="120"/>
-            </w:tcMar>
-          </w:tcPr>
-          <w:p>
-            <w:r>
-              <w:rPr>
-                <w:rFonts w:ascii="Arial" w:eastAsia="Microsoft YaHei"/>
-              </w:rPr>
-              <w:t xml:space="preserve">MCP 的 OAuth 2.1 Bearer Token 替代</w:t>
-            </w:r>
-          </w:p>
-        </w:tc>
-      </w:tr>
-      <w:tr>
-        <w:tc>
-          <w:tcPr>
-            <w:tcW w:type="dxa" w:w="4513"/>
-            <w:tcBorders>
-              <w:top w:val="single" w:color="CCCCCC" w:sz="1"/>
-              <w:left w:val="single" w:color="CCCCCC" w:sz="1"/>
-              <w:bottom w:val="single" w:color="CCCCCC" w:sz="1"/>
-              <w:right w:val="single" w:color="CCCCCC" w:sz="1"/>
-            </w:tcBorders>
-            <w:tcMar>
-              <w:top w:type="dxa" w:w="80"/>
-              <w:left w:type="dxa" w:w="120"/>
-              <w:bottom w:type="dxa" w:w="80"/>
-              <w:right w:type="dxa" w:w="120"/>
-            </w:tcMar>
-          </w:tcPr>
-          <w:p>
-            <w:r>
-              <w:rPr>
-                <w:rFonts w:ascii="Arial" w:eastAsia="Microsoft YaHei"/>
-              </w:rPr>
-              <w:t xml:space="preserve">双嵌套响应格式 </w:t>
-            </w:r>
-            <w:r>
-              <w:rPr>
-                <w:rFonts w:ascii="Consolas" w:cs="Consolas" w:eastAsia="Consolas" w:hAnsi="Consolas"/>
-              </w:rPr>
-              <w:t xml:space="preserve">response["data"]["data"]</w:t>
-            </w:r>
-          </w:p>
-        </w:tc>
-        <w:tc>
-          <w:tcPr>
-            <w:tcW w:type="dxa" w:w="4513"/>
-            <w:tcBorders>
-              <w:top w:val="single" w:color="CCCCCC" w:sz="1"/>
-              <w:left w:val="single" w:color="CCCCCC" w:sz="1"/>
-              <w:bottom w:val="single" w:color="CCCCCC" w:sz="1"/>
-              <w:right w:val="single" w:color="CCCCCC" w:sz="1"/>
-            </w:tcBorders>
-            <w:tcMar>
-              <w:top w:type="dxa" w:w="80"/>
-              <w:left w:type="dxa" w:w="120"/>
-              <w:bottom w:type="dxa" w:w="80"/>
-              <w:right w:type="dxa" w:w="120"/>
-            </w:tcMar>
-          </w:tcPr>
-          <w:p>
-            <w:r>
-              <w:rPr>
-                <w:rFonts w:ascii="Arial" w:eastAsia="Microsoft YaHei"/>
-              </w:rPr>
-              <w:t xml:space="preserve">MCP 直接返回业务层数据</w:t>
-            </w:r>
-          </w:p>
-        </w:tc>
-      </w:tr>
-      <w:tr>
-        <w:tc>
-          <w:tcPr>
-            <w:tcW w:type="dxa" w:w="4513"/>
-            <w:tcBorders>
-              <w:top w:val="single" w:color="CCCCCC" w:sz="1"/>
-              <w:left w:val="single" w:color="CCCCCC" w:sz="1"/>
-              <w:bottom w:val="single" w:color="CCCCCC" w:sz="1"/>
-              <w:right w:val="single" w:color="CCCCCC" w:sz="1"/>
-            </w:tcBorders>
-            <w:tcMar>
-              <w:top w:type="dxa" w:w="80"/>
-              <w:left w:type="dxa" w:w="120"/>
-              <w:bottom w:type="dxa" w:w="80"/>
-              <w:right w:type="dxa" w:w="120"/>
-            </w:tcMar>
-          </w:tcPr>
-          <w:p>
-            <w:r>
-              <w:rPr>
-                <w:rFonts w:ascii="Consolas" w:cs="Consolas" w:eastAsia="Consolas" w:hAnsi="Consolas"/>
-              </w:rPr>
-              <w:t xml:space="preserve">X-Td-Signature</w:t>
-            </w:r>
-            <w:r>
-              <w:rPr>
-                <w:rFonts w:ascii="Arial" w:eastAsia="Microsoft YaHei"/>
-              </w:rPr>
-              <w:t xml:space="preserve"> 请求签名（uniteApi）</w:t>
-            </w:r>
-          </w:p>
-        </w:tc>
-        <w:tc>
-          <w:tcPr>
-            <w:tcW w:type="dxa" w:w="4513"/>
-            <w:tcBorders>
-              <w:top w:val="single" w:color="CCCCCC" w:sz="1"/>
-              <w:left w:val="single" w:color="CCCCCC" w:sz="1"/>
-              <w:bottom w:val="single" w:color="CCCCCC" w:sz="1"/>
-              <w:right w:val="single" w:color="CCCCCC" w:sz="1"/>
-            </w:tcBorders>
-            <w:tcMar>
-              <w:top w:type="dxa" w:w="80"/>
-              <w:left w:type="dxa" w:w="120"/>
-              <w:bottom w:type="dxa" w:w="80"/>
-              <w:right w:type="dxa" w:w="120"/>
-            </w:tcMar>
-          </w:tcPr>
-          <w:p>
-            <w:r>
-              <w:rPr>
-                <w:rFonts w:ascii="Arial" w:eastAsia="Microsoft YaHei"/>
-              </w:rPr>
-              <w:t xml:space="preserve">MCP 服务端内部处理</w:t>
-            </w:r>
-          </w:p>
-        </w:tc>
-      </w:tr>
-      <w:tr>
-        <w:tc>
-          <w:tcPr>
-            <w:tcW w:type="dxa" w:w="4513"/>
-            <w:tcBorders>
-              <w:top w:val="single" w:color="CCCCCC" w:sz="1"/>
-              <w:left w:val="single" w:color="CCCCCC" w:sz="1"/>
-              <w:bottom w:val="single" w:color="CCCCCC" w:sz="1"/>
-              <w:right w:val="single" w:color="CCCCCC" w:sz="1"/>
-            </w:tcBorders>
-            <w:tcMar>
-              <w:top w:type="dxa" w:w="80"/>
-              <w:left w:type="dxa" w:w="120"/>
-              <w:bottom w:type="dxa" w:w="80"/>
-              <w:right w:type="dxa" w:w="120"/>
-            </w:tcMar>
-          </w:tcPr>
-          <w:p>
-            <w:r>
-              <w:rPr>
-                <w:rFonts w:ascii="Arial" w:eastAsia="Microsoft YaHei"/>
-              </w:rPr>
-              <w:t xml:space="preserve">版本自检 / skill-sync 比对</w:t>
-            </w:r>
-          </w:p>
-        </w:tc>
-        <w:tc>
-          <w:tcPr>
-            <w:tcW w:type="dxa" w:w="4513"/>
-            <w:tcBorders>
-              <w:top w:val="single" w:color="CCCCCC" w:sz="1"/>
-              <w:left w:val="single" w:color="CCCCCC" w:sz="1"/>
-              <w:bottom w:val="single" w:color="CCCCCC" w:sz="1"/>
-              <w:right w:val="single" w:color="CCCCCC" w:sz="1"/>
-            </w:tcBorders>
-            <w:tcMar>
-              <w:top w:type="dxa" w:w="80"/>
-              <w:left w:type="dxa" w:w="120"/>
-              <w:bottom w:type="dxa" w:w="80"/>
-              <w:right w:type="dxa" w:w="120"/>
-            </w:tcMar>
-          </w:tcPr>
-          <w:p>
-            <w:r>
-              <w:rPr>
-                <w:rFonts w:ascii="Arial" w:eastAsia="Microsoft YaHei"/>
-              </w:rPr>
-              <w:t xml:space="preserve">不再需要（MCP 端维护版本）</w:t>
-            </w:r>
-          </w:p>
-        </w:tc>
-      </w:tr>
-    </w:tbl>
-    <w:p>
-      <w:r>
-        <w:t xml:space="preserve"/>
-      </w:r>
-    </w:p>
-    <w:p>
-      <w:pPr>
-        <w:spacing w:after="120" w:line="360" w:lineRule="auto"/>
-        <w:ind w:firstLine="480"/>
-      </w:pPr>
-      <w:r>
-        <w:rPr>
-          <w:rFonts w:ascii="Arial" w:eastAsia="Microsoft YaHei"/>
-        </w:rPr>
-        <w:t xml:space="preserve">Skill 保留部分：极少。选择哪些类别的元数据属于"编排决策"，可由上层 skill 或 agent 直接通过 MCP 参数指定。类别间依赖警告（如 B 类单独拉取时枚举值不完整）可编码为 MCP 的 </w:t>
-      </w:r>
-      <w:r>
-        <w:rPr>
-          <w:rFonts w:ascii="Consolas" w:cs="Consolas" w:eastAsia="Consolas" w:hAnsi="Consolas"/>
-        </w:rPr>
-        <w:t xml:space="preserve">warnings</w:t>
-      </w:r>
-      <w:r>
-        <w:rPr>
-          <w:rFonts w:ascii="Arial" w:eastAsia="Microsoft YaHei"/>
-        </w:rPr>
-        <w:t xml:space="preserve"> 返回。</w:t>
-      </w:r>
-    </w:p>
-    <w:p>
-      <w:pPr>
-        <w:pStyle w:val="Heading4"/>
-      </w:pPr>
-      <w:r>
-        <w:rPr>
-          <w:rFonts w:ascii="Arial" w:eastAsia="Microsoft YaHei"/>
-        </w:rPr>
-        <w:t xml:space="preserve">3. tiance-component-lifecycle（组件全生命周期 → MCP 计划/执行模式）</w:t>
+        <w:t xml:space="preserve">2. tiance-component-lifecycle（组件全生命周期 → MCP 计划/执行模式）</w:t>
       </w:r>
     </w:p>
     <w:p>
@@ -7297,110 +6434,6 @@
               <w:rPr>
                 <w:rFonts w:ascii="Arial" w:eastAsia="Microsoft YaHei"/>
               </w:rPr>
-              <w:t xml:space="preserve">tiance-metadata</w:t>
-            </w:r>
-          </w:p>
-        </w:tc>
-        <w:tc>
-          <w:tcPr>
-            <w:tcW w:type="dxa" w:w="2256"/>
-            <w:tcBorders>
-              <w:top w:val="single" w:color="CCCCCC" w:sz="1"/>
-              <w:left w:val="single" w:color="CCCCCC" w:sz="1"/>
-              <w:bottom w:val="single" w:color="CCCCCC" w:sz="1"/>
-              <w:right w:val="single" w:color="CCCCCC" w:sz="1"/>
-            </w:tcBorders>
-            <w:tcMar>
-              <w:top w:type="dxa" w:w="80"/>
-              <w:left w:type="dxa" w:w="120"/>
-              <w:bottom w:type="dxa" w:w="80"/>
-              <w:right w:type="dxa" w:w="120"/>
-            </w:tcMar>
-          </w:tcPr>
-          <w:p>
-            <w:r>
-              <w:rPr>
-                <w:rFonts w:ascii="Arial" w:eastAsia="Microsoft YaHei"/>
-                <w:b/>
-                <w:bCs/>
-              </w:rPr>
-              <w:t xml:space="preserve">完全替代</w:t>
-            </w:r>
-          </w:p>
-        </w:tc>
-        <w:tc>
-          <w:tcPr>
-            <w:tcW w:type="dxa" w:w="2256"/>
-            <w:tcBorders>
-              <w:top w:val="single" w:color="CCCCCC" w:sz="1"/>
-              <w:left w:val="single" w:color="CCCCCC" w:sz="1"/>
-              <w:bottom w:val="single" w:color="CCCCCC" w:sz="1"/>
-              <w:right w:val="single" w:color="CCCCCC" w:sz="1"/>
-            </w:tcBorders>
-            <w:tcMar>
-              <w:top w:type="dxa" w:w="80"/>
-              <w:left w:type="dxa" w:w="120"/>
-              <w:bottom w:type="dxa" w:w="80"/>
-              <w:right w:type="dxa" w:w="120"/>
-            </w:tcMar>
-          </w:tcPr>
-          <w:p>
-            <w:r>
-              <w:rPr>
-                <w:rFonts w:ascii="Arial" w:eastAsia="Microsoft YaHei"/>
-              </w:rPr>
-              <w:t xml:space="preserve">15 端点</w:t>
-            </w:r>
-          </w:p>
-        </w:tc>
-        <w:tc>
-          <w:tcPr>
-            <w:tcW w:type="dxa" w:w="2256"/>
-            <w:tcBorders>
-              <w:top w:val="single" w:color="CCCCCC" w:sz="1"/>
-              <w:left w:val="single" w:color="CCCCCC" w:sz="1"/>
-              <w:bottom w:val="single" w:color="CCCCCC" w:sz="1"/>
-              <w:right w:val="single" w:color="CCCCCC" w:sz="1"/>
-            </w:tcBorders>
-            <w:tcMar>
-              <w:top w:type="dxa" w:w="80"/>
-              <w:left w:type="dxa" w:w="120"/>
-              <w:bottom w:type="dxa" w:w="80"/>
-              <w:right w:type="dxa" w:w="120"/>
-            </w:tcMar>
-          </w:tcPr>
-          <w:p>
-            <w:r>
-              <w:rPr>
-                <w:rFonts w:ascii="Arial" w:eastAsia="Microsoft YaHei"/>
-              </w:rPr>
-              <w:t xml:space="preserve">是</w:t>
-            </w:r>
-          </w:p>
-        </w:tc>
-      </w:tr>
-      <w:tr>
-        <w:tc>
-          <w:tcPr>
-            <w:tcW w:type="dxa" w:w="2256"/>
-            <w:tcBorders>
-              <w:top w:val="single" w:color="CCCCCC" w:sz="1"/>
-              <w:left w:val="single" w:color="CCCCCC" w:sz="1"/>
-              <w:bottom w:val="single" w:color="CCCCCC" w:sz="1"/>
-              <w:right w:val="single" w:color="CCCCCC" w:sz="1"/>
-            </w:tcBorders>
-            <w:tcMar>
-              <w:top w:type="dxa" w:w="80"/>
-              <w:left w:type="dxa" w:w="120"/>
-              <w:bottom w:type="dxa" w:w="80"/>
-              <w:right w:type="dxa" w:w="120"/>
-            </w:tcMar>
-          </w:tcPr>
-          <w:p>
-            <w:r>
-              <w:rPr>
-                <w:rFonts w:ascii="Arial" w:eastAsia="Microsoft YaHei"/>
-              </w:rPr>
               <w:t xml:space="preserve">tiance-metadata-scout</w:t>
             </w:r>
           </w:p>
@@ -9409,7 +8442,7 @@
         <w:rPr>
           <w:rFonts w:ascii="Arial" w:eastAsia="Microsoft YaHei"/>
         </w:rPr>
-        <w:t xml:space="preserve">server.py、Puppeteer 登录点击。涉及 tiance-metadata、tiance-metadata-scout、tiance-component-lifecycle、tiance-policy-test、tiance-model-strategy 共 5 个 skill。</w:t>
+        <w:t xml:space="preserve">server.py、Puppeteer 登录点击。涉及 tiance-metadata-scout、tiance-component-lifecycle、tiance-policy-test、tiance-model-strategy 共 4 个 skill。</w:t>
       </w:r>
     </w:p>
     <w:p>
@@ -9435,7 +8468,7 @@
         <w:rPr>
           <w:rFonts w:ascii="Arial" w:eastAsia="Microsoft YaHei"/>
         </w:rPr>
-        <w:t xml:space="preserve">完全替代：tiance-metadata（15 端点 → 6 个 MCP 工具调用）和 tiance-metadata-scout（42 端点 → 按需 MCP 调用）。关键收益：消除 4 种连接模式的分支逻辑、消除各端点分页协议差异（curPage vs page vs currentPage）、消除 Captain API 的四层嵌套和分页差异。</w:t>
+        <w:t xml:space="preserve">完全替代：tiance-metadata-scout（42 端点 → 按需 MCP 调用）。关键收益：消除 4 种连接模式的分支逻辑、消除各端点分页协议差异（curPage vs page vs currentPage）、消除 Captain API 的四层嵌套和分页差异。</w:t>
       </w:r>
     </w:p>
     <w:p>

</xml_diff>